<commit_message>
Updated frontend pages and alerts
</commit_message>
<xml_diff>
--- a/Behavionyx word doc.docx
+++ b/Behavionyx word doc.docx
@@ -2,6 +2,37 @@
 <file path=word/document.xml><?xml version="1.0" encoding="utf-8"?>
 <w:document xmlns:wpc="http://schemas.microsoft.com/office/word/2010/wordprocessingCanvas" xmlns:cx="http://schemas.microsoft.com/office/drawing/2014/chartex" xmlns:cx1="http://schemas.microsoft.com/office/drawing/2015/9/8/chartex" xmlns:cx2="http://schemas.microsoft.com/office/drawing/2015/10/21/chartex" xmlns:cx3="http://schemas.microsoft.com/office/drawing/2016/5/9/chartex" xmlns:cx4="http://schemas.microsoft.com/office/drawing/2016/5/10/chartex" xmlns:cx5="http://schemas.microsoft.com/office/drawing/2016/5/11/chartex" xmlns:cx6="http://schemas.microsoft.com/office/drawing/2016/5/12/chartex" xmlns:cx7="http://schemas.microsoft.com/office/drawing/2016/5/13/chartex" xmlns:cx8="http://schemas.microsoft.com/office/drawing/2016/5/14/chartex" xmlns:mc="http://schemas.openxmlformats.org/markup-compatibility/2006" xmlns:aink="http://schemas.microsoft.com/office/drawing/2016/ink" xmlns:am3d="http://schemas.microsoft.com/office/drawing/2017/model3d" xmlns:o="urn:schemas-microsoft-com:office:office" xmlns:oel="http://schemas.microsoft.com/office/2019/extlst" xmlns:r="http://schemas.openxmlformats.org/officeDocument/2006/relationships" xmlns:m="http://schemas.openxmlformats.org/officeDocument/2006/math" xmlns:v="urn:schemas-microsoft-com:vml" xmlns:wp14="http://schemas.microsoft.com/office/word/2010/wordprocessingDrawing" xmlns:wp="http://schemas.openxmlformats.org/drawingml/2006/wordprocessingDrawing" xmlns:w10="urn:schemas-microsoft-com:office:word" xmlns:w="http://schemas.openxmlformats.org/wordprocessingml/2006/main" xmlns:w14="http://schemas.microsoft.com/office/word/2010/wordml" xmlns:w15="http://schemas.microsoft.com/office/word/2012/wordml" xmlns:w16cex="http://schemas.microsoft.com/office/word/2018/wordml/cex" xmlns:w16cid="http://schemas.microsoft.com/office/word/2016/wordml/cid" xmlns:w16="http://schemas.microsoft.com/office/word/2018/wordml" xmlns:w16du="http://schemas.microsoft.com/office/word/2023/wordml/word16du" xmlns:w16sdtdh="http://schemas.microsoft.com/office/word/2020/wordml/sdtdatahash" xmlns:w16sdtfl="http://schemas.microsoft.com/office/word/2024/wordml/sdtformatlock" xmlns:w16se="http://schemas.microsoft.com/office/word/2015/wordml/symex" xmlns:wpg="http://schemas.microsoft.com/office/word/2010/wordprocessingGroup" xmlns:wpi="http://schemas.microsoft.com/office/word/2010/wordprocessingInk" xmlns:wne="http://schemas.microsoft.com/office/word/2006/wordml" xmlns:wps="http://schemas.microsoft.com/office/word/2010/wordprocessingShape" mc:Ignorable="w14 w15 w16se w16cid w16 w16cex w16sdtdh w16sdtfl w16du wp14">
   <w:body>
+    <w:p>
+      <w:pPr>
+        <w:rPr>
+          <w:rFonts w:ascii="Segoe UI Emoji" w:hAnsi="Segoe UI Emoji" w:cs="Segoe UI Emoji"/>
+          <w:b/>
+          <w:bCs/>
+          <w:sz w:val="24"/>
+          <w:szCs w:val="24"/>
+        </w:rPr>
+      </w:pPr>
+      <w:r>
+        <w:rPr>
+          <w:rFonts w:ascii="Segoe UI Emoji" w:hAnsi="Segoe UI Emoji" w:cs="Segoe UI Emoji"/>
+          <w:b/>
+          <w:bCs/>
+          <w:sz w:val="24"/>
+          <w:szCs w:val="24"/>
+        </w:rPr>
+        <w:t xml:space="preserve">GitHub link: </w:t>
+      </w:r>
+      <w:r>
+        <w:rPr>
+          <w:rFonts w:ascii="Segoe UI Emoji" w:hAnsi="Segoe UI Emoji" w:cs="Segoe UI Emoji"/>
+          <w:b/>
+          <w:bCs/>
+          <w:sz w:val="24"/>
+          <w:szCs w:val="24"/>
+        </w:rPr>
+        <w:t>https://github.com/mangekrisha10/Behavionyx</w:t>
+      </w:r>
+    </w:p>
     <w:p>
       <w:pPr>
         <w:rPr>
@@ -539,7 +570,6 @@
           <w:b/>
           <w:bCs/>
         </w:rPr>
-        <w:lastRenderedPageBreak/>
         <w:t>🎯</w:t>
       </w:r>
       <w:r>
@@ -963,6 +993,7 @@
         <w:rPr>
           <w:rFonts w:ascii="Segoe UI Emoji" w:hAnsi="Segoe UI Emoji" w:cs="Segoe UI Emoji"/>
         </w:rPr>
+        <w:lastRenderedPageBreak/>
         <w:t>👉</w:t>
       </w:r>
       <w:r>
@@ -977,7 +1008,6 @@
         </w:numPr>
       </w:pPr>
       <w:r>
-        <w:lastRenderedPageBreak/>
         <w:t xml:space="preserve">Device type </w:t>
       </w:r>
     </w:p>
@@ -1173,220 +1203,6 @@
     </w:p>
     <w:p>
       <w:r>
-        <w:t>        }</w:t>
-      </w:r>
-    </w:p>
-    <w:p>
-      <w:r>
-        <w:lastRenderedPageBreak/>
-        <w:t xml:space="preserve">        </w:t>
-      </w:r>
-    </w:p>
-    <w:p>
-      <w:r>
-        <w:t xml:space="preserve">        </w:t>
-      </w:r>
-      <w:proofErr w:type="gramStart"/>
-      <w:r>
-        <w:t>.card</w:t>
-      </w:r>
-      <w:proofErr w:type="gramEnd"/>
-      <w:r>
-        <w:t xml:space="preserve"> {</w:t>
-      </w:r>
-    </w:p>
-    <w:p>
-      <w:r>
-        <w:t>            background: white;</w:t>
-      </w:r>
-    </w:p>
-    <w:p>
-      <w:r>
-        <w:t>            padding: 20px;</w:t>
-      </w:r>
-    </w:p>
-    <w:p>
-      <w:r>
-        <w:t>            border-radius: 12px;</w:t>
-      </w:r>
-    </w:p>
-    <w:p>
-      <w:r>
-        <w:t>            margin-bottom: 20px;</w:t>
-      </w:r>
-    </w:p>
-    <w:p>
-      <w:r>
-        <w:t xml:space="preserve">            box-shadow: 0 4px 10px </w:t>
-      </w:r>
-      <w:proofErr w:type="spellStart"/>
-      <w:proofErr w:type="gramStart"/>
-      <w:r>
-        <w:t>rgba</w:t>
-      </w:r>
-      <w:proofErr w:type="spellEnd"/>
-      <w:r>
-        <w:t>(</w:t>
-      </w:r>
-      <w:proofErr w:type="gramEnd"/>
-      <w:r>
-        <w:t>0, 0, 0, 0.05);</w:t>
-      </w:r>
-    </w:p>
-    <w:p>
-      <w:r>
-        <w:t>        }</w:t>
-      </w:r>
-    </w:p>
-    <w:p>
-      <w:r>
-        <w:t xml:space="preserve">        </w:t>
-      </w:r>
-    </w:p>
-    <w:p>
-      <w:r>
-        <w:t xml:space="preserve">        </w:t>
-      </w:r>
-      <w:proofErr w:type="gramStart"/>
-      <w:r>
-        <w:t>.title</w:t>
-      </w:r>
-      <w:proofErr w:type="gramEnd"/>
-      <w:r>
-        <w:t xml:space="preserve"> {</w:t>
-      </w:r>
-    </w:p>
-    <w:p>
-      <w:r>
-        <w:t>            font-size: 14px;</w:t>
-      </w:r>
-    </w:p>
-    <w:p>
-      <w:r>
-        <w:t xml:space="preserve">            </w:t>
-      </w:r>
-      <w:proofErr w:type="spellStart"/>
-      <w:r>
-        <w:t>color</w:t>
-      </w:r>
-      <w:proofErr w:type="spellEnd"/>
-      <w:r>
-        <w:t>: #6b7280;</w:t>
-      </w:r>
-    </w:p>
-    <w:p>
-      <w:r>
-        <w:t>        }</w:t>
-      </w:r>
-    </w:p>
-    <w:p>
-      <w:r>
-        <w:t xml:space="preserve">        </w:t>
-      </w:r>
-    </w:p>
-    <w:p>
-      <w:r>
-        <w:t>        .value {</w:t>
-      </w:r>
-    </w:p>
-    <w:p>
-      <w:r>
-        <w:t>            font-size: 28px;</w:t>
-      </w:r>
-    </w:p>
-    <w:p>
-      <w:r>
-        <w:t>            font-weight: bold;</w:t>
-      </w:r>
-    </w:p>
-    <w:p>
-      <w:r>
-        <w:t>            margin-top: 5px;</w:t>
-      </w:r>
-    </w:p>
-    <w:p>
-      <w:r>
-        <w:t>        }</w:t>
-      </w:r>
-    </w:p>
-    <w:p>
-      <w:r>
-        <w:t xml:space="preserve">        </w:t>
-      </w:r>
-    </w:p>
-    <w:p>
-      <w:r>
-        <w:t xml:space="preserve">        </w:t>
-      </w:r>
-      <w:proofErr w:type="gramStart"/>
-      <w:r>
-        <w:t>.bar</w:t>
-      </w:r>
-      <w:proofErr w:type="gramEnd"/>
-      <w:r>
-        <w:t xml:space="preserve"> {</w:t>
-      </w:r>
-    </w:p>
-    <w:p>
-      <w:r>
-        <w:t>            height: 6px;</w:t>
-      </w:r>
-    </w:p>
-    <w:p>
-      <w:r>
-        <w:t>            background: #e5e7eb;</w:t>
-      </w:r>
-    </w:p>
-    <w:p>
-      <w:r>
-        <w:t>            border-radius: 10px;</w:t>
-      </w:r>
-    </w:p>
-    <w:p>
-      <w:r>
-        <w:t>            margin-top: 10px;</w:t>
-      </w:r>
-    </w:p>
-    <w:p>
-      <w:r>
-        <w:t>            overflow: hidden;</w:t>
-      </w:r>
-    </w:p>
-    <w:p>
-      <w:r>
-        <w:t>        }</w:t>
-      </w:r>
-    </w:p>
-    <w:p>
-      <w:r>
-        <w:t xml:space="preserve">        </w:t>
-      </w:r>
-    </w:p>
-    <w:p>
-      <w:r>
-        <w:t xml:space="preserve">        </w:t>
-      </w:r>
-      <w:proofErr w:type="gramStart"/>
-      <w:r>
-        <w:t>.bar</w:t>
-      </w:r>
-      <w:proofErr w:type="gramEnd"/>
-      <w:r>
-        <w:t>-fill {</w:t>
-      </w:r>
-    </w:p>
-    <w:p>
-      <w:r>
-        <w:t>            height: 100%;</w:t>
-      </w:r>
-    </w:p>
-    <w:p>
-      <w:r>
-        <w:t>            background: #111827;</w:t>
-      </w:r>
-    </w:p>
-    <w:p>
-      <w:r>
         <w:lastRenderedPageBreak/>
         <w:t>        }</w:t>
       </w:r>
@@ -1402,6 +1218,220 @@
       </w:r>
       <w:proofErr w:type="gramStart"/>
       <w:r>
+        <w:t>.card</w:t>
+      </w:r>
+      <w:proofErr w:type="gramEnd"/>
+      <w:r>
+        <w:t xml:space="preserve"> {</w:t>
+      </w:r>
+    </w:p>
+    <w:p>
+      <w:r>
+        <w:t>            background: white;</w:t>
+      </w:r>
+    </w:p>
+    <w:p>
+      <w:r>
+        <w:t>            padding: 20px;</w:t>
+      </w:r>
+    </w:p>
+    <w:p>
+      <w:r>
+        <w:t>            border-radius: 12px;</w:t>
+      </w:r>
+    </w:p>
+    <w:p>
+      <w:r>
+        <w:t>            margin-bottom: 20px;</w:t>
+      </w:r>
+    </w:p>
+    <w:p>
+      <w:r>
+        <w:t xml:space="preserve">            box-shadow: 0 4px 10px </w:t>
+      </w:r>
+      <w:proofErr w:type="spellStart"/>
+      <w:proofErr w:type="gramStart"/>
+      <w:r>
+        <w:t>rgba</w:t>
+      </w:r>
+      <w:proofErr w:type="spellEnd"/>
+      <w:r>
+        <w:t>(</w:t>
+      </w:r>
+      <w:proofErr w:type="gramEnd"/>
+      <w:r>
+        <w:t>0, 0, 0, 0.05);</w:t>
+      </w:r>
+    </w:p>
+    <w:p>
+      <w:r>
+        <w:t>        }</w:t>
+      </w:r>
+    </w:p>
+    <w:p>
+      <w:r>
+        <w:t xml:space="preserve">        </w:t>
+      </w:r>
+    </w:p>
+    <w:p>
+      <w:r>
+        <w:t xml:space="preserve">        </w:t>
+      </w:r>
+      <w:proofErr w:type="gramStart"/>
+      <w:r>
+        <w:t>.title</w:t>
+      </w:r>
+      <w:proofErr w:type="gramEnd"/>
+      <w:r>
+        <w:t xml:space="preserve"> {</w:t>
+      </w:r>
+    </w:p>
+    <w:p>
+      <w:r>
+        <w:t>            font-size: 14px;</w:t>
+      </w:r>
+    </w:p>
+    <w:p>
+      <w:r>
+        <w:t xml:space="preserve">            </w:t>
+      </w:r>
+      <w:proofErr w:type="spellStart"/>
+      <w:r>
+        <w:t>color</w:t>
+      </w:r>
+      <w:proofErr w:type="spellEnd"/>
+      <w:r>
+        <w:t>: #6b7280;</w:t>
+      </w:r>
+    </w:p>
+    <w:p>
+      <w:r>
+        <w:t>        }</w:t>
+      </w:r>
+    </w:p>
+    <w:p>
+      <w:r>
+        <w:t xml:space="preserve">        </w:t>
+      </w:r>
+    </w:p>
+    <w:p>
+      <w:r>
+        <w:t>        .value {</w:t>
+      </w:r>
+    </w:p>
+    <w:p>
+      <w:r>
+        <w:t>            font-size: 28px;</w:t>
+      </w:r>
+    </w:p>
+    <w:p>
+      <w:r>
+        <w:t>            font-weight: bold;</w:t>
+      </w:r>
+    </w:p>
+    <w:p>
+      <w:r>
+        <w:t>            margin-top: 5px;</w:t>
+      </w:r>
+    </w:p>
+    <w:p>
+      <w:r>
+        <w:t>        }</w:t>
+      </w:r>
+    </w:p>
+    <w:p>
+      <w:r>
+        <w:t xml:space="preserve">        </w:t>
+      </w:r>
+    </w:p>
+    <w:p>
+      <w:r>
+        <w:t xml:space="preserve">        </w:t>
+      </w:r>
+      <w:proofErr w:type="gramStart"/>
+      <w:r>
+        <w:t>.bar</w:t>
+      </w:r>
+      <w:proofErr w:type="gramEnd"/>
+      <w:r>
+        <w:t xml:space="preserve"> {</w:t>
+      </w:r>
+    </w:p>
+    <w:p>
+      <w:r>
+        <w:t>            height: 6px;</w:t>
+      </w:r>
+    </w:p>
+    <w:p>
+      <w:r>
+        <w:t>            background: #e5e7eb;</w:t>
+      </w:r>
+    </w:p>
+    <w:p>
+      <w:r>
+        <w:t>            border-radius: 10px;</w:t>
+      </w:r>
+    </w:p>
+    <w:p>
+      <w:r>
+        <w:t>            margin-top: 10px;</w:t>
+      </w:r>
+    </w:p>
+    <w:p>
+      <w:r>
+        <w:t>            overflow: hidden;</w:t>
+      </w:r>
+    </w:p>
+    <w:p>
+      <w:r>
+        <w:t>        }</w:t>
+      </w:r>
+    </w:p>
+    <w:p>
+      <w:r>
+        <w:t xml:space="preserve">        </w:t>
+      </w:r>
+    </w:p>
+    <w:p>
+      <w:r>
+        <w:t xml:space="preserve">        </w:t>
+      </w:r>
+      <w:proofErr w:type="gramStart"/>
+      <w:r>
+        <w:t>.bar</w:t>
+      </w:r>
+      <w:proofErr w:type="gramEnd"/>
+      <w:r>
+        <w:t>-fill {</w:t>
+      </w:r>
+    </w:p>
+    <w:p>
+      <w:r>
+        <w:t>            height: 100%;</w:t>
+      </w:r>
+    </w:p>
+    <w:p>
+      <w:r>
+        <w:lastRenderedPageBreak/>
+        <w:t>            background: #111827;</w:t>
+      </w:r>
+    </w:p>
+    <w:p>
+      <w:r>
+        <w:t>        }</w:t>
+      </w:r>
+    </w:p>
+    <w:p>
+      <w:r>
+        <w:t xml:space="preserve">        </w:t>
+      </w:r>
+    </w:p>
+    <w:p>
+      <w:r>
+        <w:t xml:space="preserve">        </w:t>
+      </w:r>
+      <w:proofErr w:type="gramStart"/>
+      <w:r>
         <w:t>.safe</w:t>
       </w:r>
       <w:proofErr w:type="gramEnd"/>
@@ -1592,6 +1622,7 @@
     <w:p/>
     <w:p>
       <w:r>
+        <w:lastRenderedPageBreak/>
         <w:t>&lt;body&gt;</w:t>
       </w:r>
     </w:p>
@@ -1783,6 +1814,7 @@
     </w:p>
     <w:p>
       <w:r>
+        <w:lastRenderedPageBreak/>
         <w:t>        &lt;/div&gt;</w:t>
       </w:r>
     </w:p>
@@ -2153,6 +2185,7 @@
     <w:p/>
     <w:p>
       <w:r>
+        <w:lastRenderedPageBreak/>
         <w:t xml:space="preserve">        function </w:t>
       </w:r>
       <w:proofErr w:type="gramStart"/>
@@ -2166,7 +2199,6 @@
     </w:p>
     <w:p>
       <w:r>
-        <w:lastRenderedPageBreak/>
         <w:t xml:space="preserve">            let </w:t>
       </w:r>
       <w:proofErr w:type="spellStart"/>
@@ -2544,6 +2576,7 @@
     </w:p>
     <w:p>
       <w:r>
+        <w:lastRenderedPageBreak/>
         <w:t xml:space="preserve">    let password = </w:t>
       </w:r>
       <w:proofErr w:type="spellStart"/>
@@ -2891,12 +2924,12 @@
     </w:p>
     <w:p>
       <w:r>
+        <w:lastRenderedPageBreak/>
         <w:t>        return;</w:t>
       </w:r>
     </w:p>
     <w:p>
       <w:r>
-        <w:lastRenderedPageBreak/>
         <w:t>    }</w:t>
       </w:r>
     </w:p>
@@ -3156,254 +3189,255 @@
     </w:p>
     <w:p>
       <w:r>
+        <w:lastRenderedPageBreak/>
         <w:t>            &lt;div class="slider"&gt;&lt;/div&gt;</w:t>
       </w:r>
     </w:p>
     <w:p>
       <w:r>
+        <w:t>        &lt;/div&gt;</w:t>
+      </w:r>
+    </w:p>
+    <w:p/>
+    <w:p>
+      <w:r>
+        <w:t xml:space="preserve">        </w:t>
+      </w:r>
+      <w:proofErr w:type="gramStart"/>
+      <w:r>
+        <w:t>&lt;!--</w:t>
+      </w:r>
+      <w:proofErr w:type="gramEnd"/>
+      <w:r>
+        <w:t xml:space="preserve"> Card --&gt;</w:t>
+      </w:r>
+    </w:p>
+    <w:p>
+      <w:r>
+        <w:t>        &lt;div class="card"&gt;</w:t>
+      </w:r>
+    </w:p>
+    <w:p/>
+    <w:p>
+      <w:r>
+        <w:t xml:space="preserve">            </w:t>
+      </w:r>
+      <w:proofErr w:type="gramStart"/>
+      <w:r>
+        <w:t>&lt;!--</w:t>
+      </w:r>
+      <w:proofErr w:type="gramEnd"/>
+      <w:r>
+        <w:t xml:space="preserve"> Login --&gt;</w:t>
+      </w:r>
+    </w:p>
+    <w:p>
+      <w:r>
+        <w:t>            &lt;div id="</w:t>
+      </w:r>
+      <w:proofErr w:type="spellStart"/>
+      <w:r>
+        <w:t>loginForm</w:t>
+      </w:r>
+      <w:proofErr w:type="spellEnd"/>
+      <w:r>
+        <w:t>"&gt;</w:t>
+      </w:r>
+    </w:p>
+    <w:p/>
+    <w:p>
+      <w:r>
+        <w:t>                &lt;div class="input-box"&gt;</w:t>
+      </w:r>
+    </w:p>
+    <w:p>
+      <w:r>
+        <w:t>                    &lt;input type="text" id="</w:t>
+      </w:r>
+      <w:proofErr w:type="spellStart"/>
+      <w:r>
+        <w:t>loginUsername</w:t>
+      </w:r>
+      <w:proofErr w:type="spellEnd"/>
+      <w:r>
+        <w:t>" placeholder="Username"&gt;</w:t>
+      </w:r>
+    </w:p>
+    <w:p>
+      <w:r>
+        <w:t>                &lt;/div&gt;</w:t>
+      </w:r>
+    </w:p>
+    <w:p/>
+    <w:p>
+      <w:r>
+        <w:t>                &lt;div class="input-box password-box"&gt;</w:t>
+      </w:r>
+    </w:p>
+    <w:p>
+      <w:r>
+        <w:t>                    &lt;input type="password" id="password" placeholder="Password"&gt;</w:t>
+      </w:r>
+    </w:p>
+    <w:p>
+      <w:r>
+        <w:t>                    &lt;span class="toggle-eye" onclick="</w:t>
+      </w:r>
+      <w:proofErr w:type="spellStart"/>
+      <w:r>
+        <w:t>togglePassword</w:t>
+      </w:r>
+      <w:proofErr w:type="spellEnd"/>
+      <w:r>
+        <w:t>('password')"&gt;</w:t>
+      </w:r>
+      <w:r>
+        <w:rPr>
+          <w:rFonts w:ascii="Segoe UI Emoji" w:hAnsi="Segoe UI Emoji" w:cs="Segoe UI Emoji"/>
+        </w:rPr>
+        <w:t>👁️</w:t>
+      </w:r>
+      <w:r>
+        <w:t>&lt;/span&gt;</w:t>
+      </w:r>
+    </w:p>
+    <w:p>
+      <w:r>
+        <w:t>                &lt;/div&gt;</w:t>
+      </w:r>
+    </w:p>
+    <w:p/>
+    <w:p>
+      <w:r>
+        <w:t>                &lt;button onclick="</w:t>
+      </w:r>
+      <w:proofErr w:type="gramStart"/>
+      <w:r>
+        <w:t>login(</w:t>
+      </w:r>
+      <w:proofErr w:type="gramEnd"/>
+      <w:r>
+        <w:t>)"&gt;Access System&lt;/button&gt;</w:t>
+      </w:r>
+    </w:p>
+    <w:p>
+      <w:r>
+        <w:t>            &lt;/div&gt;</w:t>
+      </w:r>
+    </w:p>
+    <w:p/>
+    <w:p>
+      <w:r>
+        <w:t xml:space="preserve">            </w:t>
+      </w:r>
+      <w:proofErr w:type="gramStart"/>
+      <w:r>
+        <w:t>&lt;!--</w:t>
+      </w:r>
+      <w:proofErr w:type="gramEnd"/>
+      <w:r>
+        <w:t xml:space="preserve"> Signup --&gt;</w:t>
+      </w:r>
+    </w:p>
+    <w:p>
+      <w:r>
+        <w:t>            &lt;div id="</w:t>
+      </w:r>
+      <w:proofErr w:type="spellStart"/>
+      <w:r>
+        <w:t>signupForm</w:t>
+      </w:r>
+      <w:proofErr w:type="spellEnd"/>
+      <w:r>
+        <w:t>" style="</w:t>
+      </w:r>
+      <w:proofErr w:type="spellStart"/>
+      <w:proofErr w:type="gramStart"/>
+      <w:r>
+        <w:t>display:none</w:t>
+      </w:r>
+      <w:proofErr w:type="spellEnd"/>
+      <w:proofErr w:type="gramEnd"/>
+      <w:r>
+        <w:t>;"&gt;</w:t>
+      </w:r>
+    </w:p>
+    <w:p/>
+    <w:p>
+      <w:r>
+        <w:t>                &lt;div class="input-box"&gt;</w:t>
+      </w:r>
+    </w:p>
+    <w:p>
+      <w:r>
+        <w:t>                    &lt;input type="text" id="</w:t>
+      </w:r>
+      <w:proofErr w:type="spellStart"/>
+      <w:r>
+        <w:t>signupUsername</w:t>
+      </w:r>
+      <w:proofErr w:type="spellEnd"/>
+      <w:r>
+        <w:t>" placeholder="Username"&gt;</w:t>
+      </w:r>
+    </w:p>
+    <w:p>
+      <w:r>
+        <w:t>                &lt;/div&gt;</w:t>
+      </w:r>
+    </w:p>
+    <w:p/>
+    <w:p>
+      <w:r>
+        <w:t>                &lt;div class="input-box password-box"&gt;</w:t>
+      </w:r>
+    </w:p>
+    <w:p>
+      <w:r>
+        <w:t>                    &lt;input type="password" id="</w:t>
+      </w:r>
+      <w:proofErr w:type="spellStart"/>
+      <w:r>
+        <w:t>signupPassword</w:t>
+      </w:r>
+      <w:proofErr w:type="spellEnd"/>
+      <w:r>
+        <w:t>" placeholder="Password"&gt;</w:t>
+      </w:r>
+    </w:p>
+    <w:p>
+      <w:r>
+        <w:t>                    &lt;span class="toggle-eye" onclick="</w:t>
+      </w:r>
+      <w:proofErr w:type="spellStart"/>
+      <w:r>
+        <w:t>togglePassword</w:t>
+      </w:r>
+      <w:proofErr w:type="spellEnd"/>
+      <w:r>
+        <w:t>('</w:t>
+      </w:r>
+      <w:proofErr w:type="spellStart"/>
+      <w:r>
+        <w:t>signupPassword</w:t>
+      </w:r>
+      <w:proofErr w:type="spellEnd"/>
+      <w:r>
+        <w:t>')"&gt;</w:t>
+      </w:r>
+      <w:r>
+        <w:rPr>
+          <w:rFonts w:ascii="Segoe UI Emoji" w:hAnsi="Segoe UI Emoji" w:cs="Segoe UI Emoji"/>
+        </w:rPr>
+        <w:t>👁️</w:t>
+      </w:r>
+      <w:r>
+        <w:t>&lt;/span&gt;</w:t>
+      </w:r>
+    </w:p>
+    <w:p>
+      <w:r>
         <w:lastRenderedPageBreak/>
-        <w:t>        &lt;/div&gt;</w:t>
-      </w:r>
-    </w:p>
-    <w:p/>
-    <w:p>
-      <w:r>
-        <w:t xml:space="preserve">        </w:t>
-      </w:r>
-      <w:proofErr w:type="gramStart"/>
-      <w:r>
-        <w:t>&lt;!--</w:t>
-      </w:r>
-      <w:proofErr w:type="gramEnd"/>
-      <w:r>
-        <w:t xml:space="preserve"> Card --&gt;</w:t>
-      </w:r>
-    </w:p>
-    <w:p>
-      <w:r>
-        <w:t>        &lt;div class="card"&gt;</w:t>
-      </w:r>
-    </w:p>
-    <w:p/>
-    <w:p>
-      <w:r>
-        <w:t xml:space="preserve">            </w:t>
-      </w:r>
-      <w:proofErr w:type="gramStart"/>
-      <w:r>
-        <w:t>&lt;!--</w:t>
-      </w:r>
-      <w:proofErr w:type="gramEnd"/>
-      <w:r>
-        <w:t xml:space="preserve"> Login --&gt;</w:t>
-      </w:r>
-    </w:p>
-    <w:p>
-      <w:r>
-        <w:t>            &lt;div id="</w:t>
-      </w:r>
-      <w:proofErr w:type="spellStart"/>
-      <w:r>
-        <w:t>loginForm</w:t>
-      </w:r>
-      <w:proofErr w:type="spellEnd"/>
-      <w:r>
-        <w:t>"&gt;</w:t>
-      </w:r>
-    </w:p>
-    <w:p/>
-    <w:p>
-      <w:r>
-        <w:t>                &lt;div class="input-box"&gt;</w:t>
-      </w:r>
-    </w:p>
-    <w:p>
-      <w:r>
-        <w:t>                    &lt;input type="text" id="</w:t>
-      </w:r>
-      <w:proofErr w:type="spellStart"/>
-      <w:r>
-        <w:t>loginUsername</w:t>
-      </w:r>
-      <w:proofErr w:type="spellEnd"/>
-      <w:r>
-        <w:t>" placeholder="Username"&gt;</w:t>
-      </w:r>
-    </w:p>
-    <w:p>
-      <w:r>
-        <w:t>                &lt;/div&gt;</w:t>
-      </w:r>
-    </w:p>
-    <w:p/>
-    <w:p>
-      <w:r>
-        <w:t>                &lt;div class="input-box password-box"&gt;</w:t>
-      </w:r>
-    </w:p>
-    <w:p>
-      <w:r>
-        <w:t>                    &lt;input type="password" id="password" placeholder="Password"&gt;</w:t>
-      </w:r>
-    </w:p>
-    <w:p>
-      <w:r>
-        <w:t>                    &lt;span class="toggle-eye" onclick="</w:t>
-      </w:r>
-      <w:proofErr w:type="spellStart"/>
-      <w:r>
-        <w:t>togglePassword</w:t>
-      </w:r>
-      <w:proofErr w:type="spellEnd"/>
-      <w:r>
-        <w:t>('password')"&gt;</w:t>
-      </w:r>
-      <w:r>
-        <w:rPr>
-          <w:rFonts w:ascii="Segoe UI Emoji" w:hAnsi="Segoe UI Emoji" w:cs="Segoe UI Emoji"/>
-        </w:rPr>
-        <w:t>👁️</w:t>
-      </w:r>
-      <w:r>
-        <w:t>&lt;/span&gt;</w:t>
-      </w:r>
-    </w:p>
-    <w:p>
-      <w:r>
-        <w:t>                &lt;/div&gt;</w:t>
-      </w:r>
-    </w:p>
-    <w:p/>
-    <w:p>
-      <w:r>
-        <w:t>                &lt;button onclick="</w:t>
-      </w:r>
-      <w:proofErr w:type="gramStart"/>
-      <w:r>
-        <w:t>login(</w:t>
-      </w:r>
-      <w:proofErr w:type="gramEnd"/>
-      <w:r>
-        <w:t>)"&gt;Access System&lt;/button&gt;</w:t>
-      </w:r>
-    </w:p>
-    <w:p>
-      <w:r>
-        <w:t>            &lt;/div&gt;</w:t>
-      </w:r>
-    </w:p>
-    <w:p/>
-    <w:p>
-      <w:r>
-        <w:t xml:space="preserve">            </w:t>
-      </w:r>
-      <w:proofErr w:type="gramStart"/>
-      <w:r>
-        <w:t>&lt;!--</w:t>
-      </w:r>
-      <w:proofErr w:type="gramEnd"/>
-      <w:r>
-        <w:t xml:space="preserve"> Signup --&gt;</w:t>
-      </w:r>
-    </w:p>
-    <w:p>
-      <w:r>
-        <w:t>            &lt;div id="</w:t>
-      </w:r>
-      <w:proofErr w:type="spellStart"/>
-      <w:r>
-        <w:t>signupForm</w:t>
-      </w:r>
-      <w:proofErr w:type="spellEnd"/>
-      <w:r>
-        <w:t>" style="</w:t>
-      </w:r>
-      <w:proofErr w:type="spellStart"/>
-      <w:proofErr w:type="gramStart"/>
-      <w:r>
-        <w:t>display:none</w:t>
-      </w:r>
-      <w:proofErr w:type="spellEnd"/>
-      <w:proofErr w:type="gramEnd"/>
-      <w:r>
-        <w:t>;"&gt;</w:t>
-      </w:r>
-    </w:p>
-    <w:p/>
-    <w:p>
-      <w:r>
-        <w:t>                &lt;div class="input-box"&gt;</w:t>
-      </w:r>
-    </w:p>
-    <w:p>
-      <w:r>
-        <w:t>                    &lt;input type="text" id="</w:t>
-      </w:r>
-      <w:proofErr w:type="spellStart"/>
-      <w:r>
-        <w:t>signupUsername</w:t>
-      </w:r>
-      <w:proofErr w:type="spellEnd"/>
-      <w:r>
-        <w:t>" placeholder="Username"&gt;</w:t>
-      </w:r>
-    </w:p>
-    <w:p>
-      <w:r>
-        <w:t>                &lt;/div&gt;</w:t>
-      </w:r>
-    </w:p>
-    <w:p/>
-    <w:p>
-      <w:r>
-        <w:t>                &lt;div class="input-box password-box"&gt;</w:t>
-      </w:r>
-    </w:p>
-    <w:p>
-      <w:r>
-        <w:t>                    &lt;input type="password" id="</w:t>
-      </w:r>
-      <w:proofErr w:type="spellStart"/>
-      <w:r>
-        <w:t>signupPassword</w:t>
-      </w:r>
-      <w:proofErr w:type="spellEnd"/>
-      <w:r>
-        <w:t>" placeholder="Password"&gt;</w:t>
-      </w:r>
-    </w:p>
-    <w:p>
-      <w:r>
-        <w:t>                    &lt;span class="toggle-eye" onclick="</w:t>
-      </w:r>
-      <w:proofErr w:type="spellStart"/>
-      <w:r>
-        <w:t>togglePassword</w:t>
-      </w:r>
-      <w:proofErr w:type="spellEnd"/>
-      <w:r>
-        <w:t>('</w:t>
-      </w:r>
-      <w:proofErr w:type="spellStart"/>
-      <w:r>
-        <w:t>signupPassword</w:t>
-      </w:r>
-      <w:proofErr w:type="spellEnd"/>
-      <w:r>
-        <w:t>')"&gt;</w:t>
-      </w:r>
-      <w:r>
-        <w:rPr>
-          <w:rFonts w:ascii="Segoe UI Emoji" w:hAnsi="Segoe UI Emoji" w:cs="Segoe UI Emoji"/>
-        </w:rPr>
-        <w:t>👁️</w:t>
-      </w:r>
-      <w:r>
-        <w:t>&lt;/span&gt;</w:t>
-      </w:r>
-    </w:p>
-    <w:p>
-      <w:r>
         <w:t>                &lt;/div&gt;</w:t>
       </w:r>
     </w:p>
@@ -3638,6 +3672,7 @@
     </w:p>
     <w:p>
       <w:r>
+        <w:lastRenderedPageBreak/>
         <w:t xml:space="preserve">    </w:t>
       </w:r>
       <w:proofErr w:type="spellStart"/>
@@ -3657,6 +3692,857 @@
       <w:proofErr w:type="spellEnd"/>
       <w:r>
         <w:t>", () =&gt; {</w:t>
+      </w:r>
+    </w:p>
+    <w:p>
+      <w:r>
+        <w:t xml:space="preserve">        </w:t>
+      </w:r>
+      <w:proofErr w:type="spellStart"/>
+      <w:r>
+        <w:t>keyTimes.push</w:t>
+      </w:r>
+      <w:proofErr w:type="spellEnd"/>
+      <w:r>
+        <w:t>(</w:t>
+      </w:r>
+      <w:proofErr w:type="spellStart"/>
+      <w:proofErr w:type="gramStart"/>
+      <w:r>
+        <w:t>Date.now</w:t>
+      </w:r>
+      <w:proofErr w:type="spellEnd"/>
+      <w:r>
+        <w:t>(</w:t>
+      </w:r>
+      <w:proofErr w:type="gramEnd"/>
+      <w:r>
+        <w:t>));</w:t>
+      </w:r>
+    </w:p>
+    <w:p>
+      <w:r>
+        <w:t>    });</w:t>
+      </w:r>
+    </w:p>
+    <w:p>
+      <w:r>
+        <w:t>});</w:t>
+      </w:r>
+    </w:p>
+    <w:p/>
+    <w:p>
+      <w:r>
+        <w:t>// =====================</w:t>
+      </w:r>
+    </w:p>
+    <w:p>
+      <w:r>
+        <w:t>// CAPTURE MOUSE</w:t>
+      </w:r>
+    </w:p>
+    <w:p>
+      <w:r>
+        <w:t>// =====================</w:t>
+      </w:r>
+    </w:p>
+    <w:p>
+      <w:proofErr w:type="spellStart"/>
+      <w:proofErr w:type="gramStart"/>
+      <w:r>
+        <w:t>document.addEventListener</w:t>
+      </w:r>
+      <w:proofErr w:type="spellEnd"/>
+      <w:proofErr w:type="gramEnd"/>
+      <w:r>
+        <w:t>("</w:t>
+      </w:r>
+      <w:proofErr w:type="spellStart"/>
+      <w:r>
+        <w:t>mousemove</w:t>
+      </w:r>
+      <w:proofErr w:type="spellEnd"/>
+      <w:r>
+        <w:t>", (e) =&gt; {</w:t>
+      </w:r>
+    </w:p>
+    <w:p>
+      <w:r>
+        <w:t>    if (</w:t>
+      </w:r>
+      <w:proofErr w:type="spellStart"/>
+      <w:r>
+        <w:t>mouseData.length</w:t>
+      </w:r>
+      <w:proofErr w:type="spellEnd"/>
+      <w:r>
+        <w:t xml:space="preserve"> &lt; 100) {</w:t>
+      </w:r>
+    </w:p>
+    <w:p>
+      <w:r>
+        <w:t xml:space="preserve">        </w:t>
+      </w:r>
+      <w:proofErr w:type="spellStart"/>
+      <w:r>
+        <w:t>mouseData.push</w:t>
+      </w:r>
+      <w:proofErr w:type="spellEnd"/>
+      <w:r>
+        <w:t>({</w:t>
+      </w:r>
+    </w:p>
+    <w:p>
+      <w:r>
+        <w:t xml:space="preserve">            x: </w:t>
+      </w:r>
+      <w:proofErr w:type="spellStart"/>
+      <w:proofErr w:type="gramStart"/>
+      <w:r>
+        <w:t>e.clientX</w:t>
+      </w:r>
+      <w:proofErr w:type="spellEnd"/>
+      <w:proofErr w:type="gramEnd"/>
+      <w:r>
+        <w:t>,</w:t>
+      </w:r>
+    </w:p>
+    <w:p>
+      <w:r>
+        <w:t xml:space="preserve">            y: </w:t>
+      </w:r>
+      <w:proofErr w:type="spellStart"/>
+      <w:proofErr w:type="gramStart"/>
+      <w:r>
+        <w:t>e.clientY</w:t>
+      </w:r>
+      <w:proofErr w:type="spellEnd"/>
+      <w:proofErr w:type="gramEnd"/>
+      <w:r>
+        <w:t>,</w:t>
+      </w:r>
+    </w:p>
+    <w:p>
+      <w:r>
+        <w:t xml:space="preserve">            time: </w:t>
+      </w:r>
+      <w:proofErr w:type="spellStart"/>
+      <w:proofErr w:type="gramStart"/>
+      <w:r>
+        <w:t>Date.now</w:t>
+      </w:r>
+      <w:proofErr w:type="spellEnd"/>
+      <w:r>
+        <w:t>(</w:t>
+      </w:r>
+      <w:proofErr w:type="gramEnd"/>
+      <w:r>
+        <w:t>)</w:t>
+      </w:r>
+    </w:p>
+    <w:p>
+      <w:r>
+        <w:t>        });</w:t>
+      </w:r>
+    </w:p>
+    <w:p>
+      <w:r>
+        <w:t>    }</w:t>
+      </w:r>
+    </w:p>
+    <w:p>
+      <w:r>
+        <w:t>});</w:t>
+      </w:r>
+    </w:p>
+    <w:p/>
+    <w:p>
+      <w:r>
+        <w:t>// =====================</w:t>
+      </w:r>
+    </w:p>
+    <w:p>
+      <w:r>
+        <w:t>// TOGGLE LOGIN / SIGNUP</w:t>
+      </w:r>
+    </w:p>
+    <w:p>
+      <w:r>
+        <w:t>// =====================</w:t>
+      </w:r>
+    </w:p>
+    <w:p>
+      <w:r>
+        <w:t xml:space="preserve">function </w:t>
+      </w:r>
+      <w:proofErr w:type="spellStart"/>
+      <w:proofErr w:type="gramStart"/>
+      <w:r>
+        <w:t>showLogin</w:t>
+      </w:r>
+      <w:proofErr w:type="spellEnd"/>
+      <w:r>
+        <w:t>(</w:t>
+      </w:r>
+      <w:proofErr w:type="gramEnd"/>
+      <w:r>
+        <w:t>) {</w:t>
+      </w:r>
+    </w:p>
+    <w:p>
+      <w:r>
+        <w:t xml:space="preserve">    </w:t>
+      </w:r>
+      <w:proofErr w:type="spellStart"/>
+      <w:proofErr w:type="gramStart"/>
+      <w:r>
+        <w:t>document.getElementById</w:t>
+      </w:r>
+      <w:proofErr w:type="spellEnd"/>
+      <w:proofErr w:type="gramEnd"/>
+      <w:r>
+        <w:t>("</w:t>
+      </w:r>
+      <w:proofErr w:type="spellStart"/>
+      <w:r>
+        <w:t>loginForm</w:t>
+      </w:r>
+      <w:proofErr w:type="spellEnd"/>
+      <w:r>
+        <w:t>"</w:t>
+      </w:r>
+      <w:proofErr w:type="gramStart"/>
+      <w:r>
+        <w:t>).</w:t>
+      </w:r>
+      <w:proofErr w:type="spellStart"/>
+      <w:r>
+        <w:t>style</w:t>
+      </w:r>
+      <w:proofErr w:type="gramEnd"/>
+      <w:r>
+        <w:t>.display</w:t>
+      </w:r>
+      <w:proofErr w:type="spellEnd"/>
+      <w:r>
+        <w:t xml:space="preserve"> = "block";</w:t>
+      </w:r>
+    </w:p>
+    <w:p>
+      <w:r>
+        <w:t xml:space="preserve">    </w:t>
+      </w:r>
+      <w:proofErr w:type="spellStart"/>
+      <w:proofErr w:type="gramStart"/>
+      <w:r>
+        <w:t>document.getElementById</w:t>
+      </w:r>
+      <w:proofErr w:type="spellEnd"/>
+      <w:proofErr w:type="gramEnd"/>
+      <w:r>
+        <w:t>("</w:t>
+      </w:r>
+      <w:proofErr w:type="spellStart"/>
+      <w:r>
+        <w:t>signupForm</w:t>
+      </w:r>
+      <w:proofErr w:type="spellEnd"/>
+      <w:r>
+        <w:t>"</w:t>
+      </w:r>
+      <w:proofErr w:type="gramStart"/>
+      <w:r>
+        <w:t>).</w:t>
+      </w:r>
+      <w:proofErr w:type="spellStart"/>
+      <w:r>
+        <w:t>style</w:t>
+      </w:r>
+      <w:proofErr w:type="gramEnd"/>
+      <w:r>
+        <w:t>.display</w:t>
+      </w:r>
+      <w:proofErr w:type="spellEnd"/>
+      <w:r>
+        <w:t xml:space="preserve"> = "none";</w:t>
+      </w:r>
+    </w:p>
+    <w:p/>
+    <w:p>
+      <w:r>
+        <w:t xml:space="preserve">    </w:t>
+      </w:r>
+      <w:proofErr w:type="spellStart"/>
+      <w:proofErr w:type="gramStart"/>
+      <w:r>
+        <w:t>document.getElementById</w:t>
+      </w:r>
+      <w:proofErr w:type="spellEnd"/>
+      <w:proofErr w:type="gramEnd"/>
+      <w:r>
+        <w:t>("</w:t>
+      </w:r>
+      <w:proofErr w:type="spellStart"/>
+      <w:r>
+        <w:t>loginTab</w:t>
+      </w:r>
+      <w:proofErr w:type="spellEnd"/>
+      <w:r>
+        <w:t>"</w:t>
+      </w:r>
+      <w:proofErr w:type="gramStart"/>
+      <w:r>
+        <w:t>).</w:t>
+      </w:r>
+      <w:proofErr w:type="spellStart"/>
+      <w:r>
+        <w:t>classList.add</w:t>
+      </w:r>
+      <w:proofErr w:type="spellEnd"/>
+      <w:proofErr w:type="gramEnd"/>
+      <w:r>
+        <w:t>("active");</w:t>
+      </w:r>
+    </w:p>
+    <w:p>
+      <w:r>
+        <w:t xml:space="preserve">    </w:t>
+      </w:r>
+      <w:proofErr w:type="spellStart"/>
+      <w:proofErr w:type="gramStart"/>
+      <w:r>
+        <w:t>document.getElementById</w:t>
+      </w:r>
+      <w:proofErr w:type="spellEnd"/>
+      <w:proofErr w:type="gramEnd"/>
+      <w:r>
+        <w:t>("</w:t>
+      </w:r>
+      <w:proofErr w:type="spellStart"/>
+      <w:r>
+        <w:t>signupTab</w:t>
+      </w:r>
+      <w:proofErr w:type="spellEnd"/>
+      <w:r>
+        <w:t>"</w:t>
+      </w:r>
+      <w:proofErr w:type="gramStart"/>
+      <w:r>
+        <w:t>).</w:t>
+      </w:r>
+      <w:proofErr w:type="spellStart"/>
+      <w:r>
+        <w:t>classList.remove</w:t>
+      </w:r>
+      <w:proofErr w:type="spellEnd"/>
+      <w:proofErr w:type="gramEnd"/>
+      <w:r>
+        <w:t>("active");</w:t>
+      </w:r>
+    </w:p>
+    <w:p/>
+    <w:p>
+      <w:r>
+        <w:t xml:space="preserve">    </w:t>
+      </w:r>
+      <w:proofErr w:type="spellStart"/>
+      <w:proofErr w:type="gramStart"/>
+      <w:r>
+        <w:t>document.querySelector</w:t>
+      </w:r>
+      <w:proofErr w:type="spellEnd"/>
+      <w:proofErr w:type="gramEnd"/>
+      <w:r>
+        <w:t>(</w:t>
+      </w:r>
+      <w:proofErr w:type="gramStart"/>
+      <w:r>
+        <w:t>".slider</w:t>
+      </w:r>
+      <w:proofErr w:type="gramEnd"/>
+      <w:r>
+        <w:t>"</w:t>
+      </w:r>
+      <w:proofErr w:type="gramStart"/>
+      <w:r>
+        <w:t>).</w:t>
+      </w:r>
+      <w:proofErr w:type="spellStart"/>
+      <w:r>
+        <w:t>style</w:t>
+      </w:r>
+      <w:proofErr w:type="gramEnd"/>
+      <w:r>
+        <w:t>.left</w:t>
+      </w:r>
+      <w:proofErr w:type="spellEnd"/>
+      <w:r>
+        <w:t xml:space="preserve"> = "0%";</w:t>
+      </w:r>
+    </w:p>
+    <w:p>
+      <w:r>
+        <w:t>}</w:t>
+      </w:r>
+    </w:p>
+    <w:p/>
+    <w:p>
+      <w:r>
+        <w:lastRenderedPageBreak/>
+        <w:t xml:space="preserve">function </w:t>
+      </w:r>
+      <w:proofErr w:type="spellStart"/>
+      <w:proofErr w:type="gramStart"/>
+      <w:r>
+        <w:t>showSignup</w:t>
+      </w:r>
+      <w:proofErr w:type="spellEnd"/>
+      <w:r>
+        <w:t>(</w:t>
+      </w:r>
+      <w:proofErr w:type="gramEnd"/>
+      <w:r>
+        <w:t>) {</w:t>
+      </w:r>
+    </w:p>
+    <w:p>
+      <w:r>
+        <w:t xml:space="preserve">    </w:t>
+      </w:r>
+      <w:proofErr w:type="spellStart"/>
+      <w:proofErr w:type="gramStart"/>
+      <w:r>
+        <w:t>document.getElementById</w:t>
+      </w:r>
+      <w:proofErr w:type="spellEnd"/>
+      <w:proofErr w:type="gramEnd"/>
+      <w:r>
+        <w:t>("</w:t>
+      </w:r>
+      <w:proofErr w:type="spellStart"/>
+      <w:r>
+        <w:t>loginForm</w:t>
+      </w:r>
+      <w:proofErr w:type="spellEnd"/>
+      <w:r>
+        <w:t>"</w:t>
+      </w:r>
+      <w:proofErr w:type="gramStart"/>
+      <w:r>
+        <w:t>).</w:t>
+      </w:r>
+      <w:proofErr w:type="spellStart"/>
+      <w:r>
+        <w:t>style</w:t>
+      </w:r>
+      <w:proofErr w:type="gramEnd"/>
+      <w:r>
+        <w:t>.display</w:t>
+      </w:r>
+      <w:proofErr w:type="spellEnd"/>
+      <w:r>
+        <w:t xml:space="preserve"> = "none";</w:t>
+      </w:r>
+    </w:p>
+    <w:p>
+      <w:r>
+        <w:t xml:space="preserve">    </w:t>
+      </w:r>
+      <w:proofErr w:type="spellStart"/>
+      <w:proofErr w:type="gramStart"/>
+      <w:r>
+        <w:t>document.getElementById</w:t>
+      </w:r>
+      <w:proofErr w:type="spellEnd"/>
+      <w:proofErr w:type="gramEnd"/>
+      <w:r>
+        <w:t>("</w:t>
+      </w:r>
+      <w:proofErr w:type="spellStart"/>
+      <w:r>
+        <w:t>signupForm</w:t>
+      </w:r>
+      <w:proofErr w:type="spellEnd"/>
+      <w:r>
+        <w:t>"</w:t>
+      </w:r>
+      <w:proofErr w:type="gramStart"/>
+      <w:r>
+        <w:t>).</w:t>
+      </w:r>
+      <w:proofErr w:type="spellStart"/>
+      <w:r>
+        <w:t>style</w:t>
+      </w:r>
+      <w:proofErr w:type="gramEnd"/>
+      <w:r>
+        <w:t>.display</w:t>
+      </w:r>
+      <w:proofErr w:type="spellEnd"/>
+      <w:r>
+        <w:t xml:space="preserve"> = "block";</w:t>
+      </w:r>
+    </w:p>
+    <w:p/>
+    <w:p>
+      <w:r>
+        <w:t xml:space="preserve">    </w:t>
+      </w:r>
+      <w:proofErr w:type="spellStart"/>
+      <w:proofErr w:type="gramStart"/>
+      <w:r>
+        <w:t>document.getElementById</w:t>
+      </w:r>
+      <w:proofErr w:type="spellEnd"/>
+      <w:proofErr w:type="gramEnd"/>
+      <w:r>
+        <w:t>("</w:t>
+      </w:r>
+      <w:proofErr w:type="spellStart"/>
+      <w:r>
+        <w:t>signupTab</w:t>
+      </w:r>
+      <w:proofErr w:type="spellEnd"/>
+      <w:r>
+        <w:t>"</w:t>
+      </w:r>
+      <w:proofErr w:type="gramStart"/>
+      <w:r>
+        <w:t>).</w:t>
+      </w:r>
+      <w:proofErr w:type="spellStart"/>
+      <w:r>
+        <w:t>classList.add</w:t>
+      </w:r>
+      <w:proofErr w:type="spellEnd"/>
+      <w:proofErr w:type="gramEnd"/>
+      <w:r>
+        <w:t>("active");</w:t>
+      </w:r>
+    </w:p>
+    <w:p>
+      <w:r>
+        <w:t xml:space="preserve">    </w:t>
+      </w:r>
+      <w:proofErr w:type="spellStart"/>
+      <w:proofErr w:type="gramStart"/>
+      <w:r>
+        <w:t>document.getElementById</w:t>
+      </w:r>
+      <w:proofErr w:type="spellEnd"/>
+      <w:proofErr w:type="gramEnd"/>
+      <w:r>
+        <w:t>("</w:t>
+      </w:r>
+      <w:proofErr w:type="spellStart"/>
+      <w:r>
+        <w:t>loginTab</w:t>
+      </w:r>
+      <w:proofErr w:type="spellEnd"/>
+      <w:r>
+        <w:t>"</w:t>
+      </w:r>
+      <w:proofErr w:type="gramStart"/>
+      <w:r>
+        <w:t>).</w:t>
+      </w:r>
+      <w:proofErr w:type="spellStart"/>
+      <w:r>
+        <w:t>classList.remove</w:t>
+      </w:r>
+      <w:proofErr w:type="spellEnd"/>
+      <w:proofErr w:type="gramEnd"/>
+      <w:r>
+        <w:t>("active");</w:t>
+      </w:r>
+    </w:p>
+    <w:p/>
+    <w:p>
+      <w:r>
+        <w:t xml:space="preserve">    </w:t>
+      </w:r>
+      <w:proofErr w:type="spellStart"/>
+      <w:proofErr w:type="gramStart"/>
+      <w:r>
+        <w:t>document.querySelector</w:t>
+      </w:r>
+      <w:proofErr w:type="spellEnd"/>
+      <w:proofErr w:type="gramEnd"/>
+      <w:r>
+        <w:t>(</w:t>
+      </w:r>
+      <w:proofErr w:type="gramStart"/>
+      <w:r>
+        <w:t>".slider</w:t>
+      </w:r>
+      <w:proofErr w:type="gramEnd"/>
+      <w:r>
+        <w:t>"</w:t>
+      </w:r>
+      <w:proofErr w:type="gramStart"/>
+      <w:r>
+        <w:t>).</w:t>
+      </w:r>
+      <w:proofErr w:type="spellStart"/>
+      <w:r>
+        <w:t>style</w:t>
+      </w:r>
+      <w:proofErr w:type="gramEnd"/>
+      <w:r>
+        <w:t>.left</w:t>
+      </w:r>
+      <w:proofErr w:type="spellEnd"/>
+      <w:r>
+        <w:t xml:space="preserve"> = "50%";</w:t>
+      </w:r>
+    </w:p>
+    <w:p>
+      <w:r>
+        <w:t>}</w:t>
+      </w:r>
+    </w:p>
+    <w:p/>
+    <w:p>
+      <w:r>
+        <w:t>// =====================</w:t>
+      </w:r>
+    </w:p>
+    <w:p>
+      <w:r>
+        <w:t>// TOGGLE PASSWORD</w:t>
+      </w:r>
+    </w:p>
+    <w:p>
+      <w:r>
+        <w:t>// =====================</w:t>
+      </w:r>
+    </w:p>
+    <w:p>
+      <w:r>
+        <w:t xml:space="preserve">function </w:t>
+      </w:r>
+      <w:proofErr w:type="spellStart"/>
+      <w:r>
+        <w:t>togglePassword</w:t>
+      </w:r>
+      <w:proofErr w:type="spellEnd"/>
+      <w:r>
+        <w:t>(id) {</w:t>
+      </w:r>
+    </w:p>
+    <w:p>
+      <w:r>
+        <w:t xml:space="preserve">    let input = </w:t>
+      </w:r>
+      <w:proofErr w:type="spellStart"/>
+      <w:proofErr w:type="gramStart"/>
+      <w:r>
+        <w:t>document.getElementById</w:t>
+      </w:r>
+      <w:proofErr w:type="spellEnd"/>
+      <w:proofErr w:type="gramEnd"/>
+      <w:r>
+        <w:t>(id);</w:t>
+      </w:r>
+    </w:p>
+    <w:p>
+      <w:r>
+        <w:t xml:space="preserve">    </w:t>
+      </w:r>
+      <w:proofErr w:type="spellStart"/>
+      <w:proofErr w:type="gramStart"/>
+      <w:r>
+        <w:t>input.type</w:t>
+      </w:r>
+      <w:proofErr w:type="spellEnd"/>
+      <w:proofErr w:type="gramEnd"/>
+      <w:r>
+        <w:t xml:space="preserve"> = </w:t>
+      </w:r>
+      <w:proofErr w:type="spellStart"/>
+      <w:proofErr w:type="gramStart"/>
+      <w:r>
+        <w:t>input.type</w:t>
+      </w:r>
+      <w:proofErr w:type="spellEnd"/>
+      <w:proofErr w:type="gramEnd"/>
+      <w:r>
+        <w:t xml:space="preserve"> === "password</w:t>
+      </w:r>
+      <w:proofErr w:type="gramStart"/>
+      <w:r>
+        <w:t>" ?</w:t>
+      </w:r>
+      <w:proofErr w:type="gramEnd"/>
+      <w:r>
+        <w:t xml:space="preserve"> "text</w:t>
+      </w:r>
+      <w:proofErr w:type="gramStart"/>
+      <w:r>
+        <w:t>" :</w:t>
+      </w:r>
+      <w:proofErr w:type="gramEnd"/>
+      <w:r>
+        <w:t xml:space="preserve"> "password";</w:t>
+      </w:r>
+    </w:p>
+    <w:p>
+      <w:r>
+        <w:t>}</w:t>
+      </w:r>
+    </w:p>
+    <w:p/>
+    <w:p>
+      <w:r>
+        <w:t>// =====================</w:t>
+      </w:r>
+    </w:p>
+    <w:p>
+      <w:r>
+        <w:t>// LOGIN FUNCTION (FIXED)</w:t>
+      </w:r>
+    </w:p>
+    <w:p>
+      <w:r>
+        <w:t>// =====================</w:t>
+      </w:r>
+    </w:p>
+    <w:p>
+      <w:r>
+        <w:t xml:space="preserve">function </w:t>
+      </w:r>
+      <w:proofErr w:type="gramStart"/>
+      <w:r>
+        <w:t>login(</w:t>
+      </w:r>
+      <w:proofErr w:type="gramEnd"/>
+      <w:r>
+        <w:t>) {</w:t>
+      </w:r>
+    </w:p>
+    <w:p>
+      <w:r>
+        <w:t xml:space="preserve">    let username = </w:t>
+      </w:r>
+      <w:proofErr w:type="spellStart"/>
+      <w:proofErr w:type="gramStart"/>
+      <w:r>
+        <w:t>document.querySelector</w:t>
+      </w:r>
+      <w:proofErr w:type="spellEnd"/>
+      <w:proofErr w:type="gramEnd"/>
+      <w:r>
+        <w:t>("#</w:t>
+      </w:r>
+      <w:proofErr w:type="spellStart"/>
+      <w:r>
+        <w:t>loginForm</w:t>
+      </w:r>
+      <w:proofErr w:type="spellEnd"/>
+      <w:r>
+        <w:t xml:space="preserve"> input").value;</w:t>
+      </w:r>
+    </w:p>
+    <w:p>
+      <w:r>
+        <w:t xml:space="preserve">    let password = </w:t>
+      </w:r>
+      <w:proofErr w:type="spellStart"/>
+      <w:proofErr w:type="gramStart"/>
+      <w:r>
+        <w:t>document.getElementById</w:t>
+      </w:r>
+      <w:proofErr w:type="spellEnd"/>
+      <w:proofErr w:type="gramEnd"/>
+      <w:r>
+        <w:t>("password").value;</w:t>
+      </w:r>
+    </w:p>
+    <w:p/>
+    <w:p>
+      <w:r>
+        <w:t xml:space="preserve">    let </w:t>
+      </w:r>
+      <w:proofErr w:type="spellStart"/>
+      <w:r>
+        <w:t>savedUser</w:t>
+      </w:r>
+      <w:proofErr w:type="spellEnd"/>
+      <w:r>
+        <w:t xml:space="preserve"> = </w:t>
+      </w:r>
+      <w:proofErr w:type="spellStart"/>
+      <w:r>
+        <w:t>localStorage.getItem</w:t>
+      </w:r>
+      <w:proofErr w:type="spellEnd"/>
+      <w:r>
+        <w:t>("username");</w:t>
+      </w:r>
+    </w:p>
+    <w:p>
+      <w:r>
+        <w:t xml:space="preserve">    let </w:t>
+      </w:r>
+      <w:proofErr w:type="spellStart"/>
+      <w:r>
+        <w:t>savedPass</w:t>
+      </w:r>
+      <w:proofErr w:type="spellEnd"/>
+      <w:r>
+        <w:t xml:space="preserve"> = </w:t>
+      </w:r>
+      <w:proofErr w:type="spellStart"/>
+      <w:r>
+        <w:t>localStorage.getItem</w:t>
+      </w:r>
+      <w:proofErr w:type="spellEnd"/>
+      <w:r>
+        <w:t>("password");</w:t>
+      </w:r>
+    </w:p>
+    <w:p/>
+    <w:p>
+      <w:r>
+        <w:t xml:space="preserve">    if (username === </w:t>
+      </w:r>
+      <w:proofErr w:type="spellStart"/>
+      <w:r>
+        <w:t>savedUser</w:t>
+      </w:r>
+      <w:proofErr w:type="spellEnd"/>
+      <w:r>
+        <w:t xml:space="preserve"> &amp;&amp; password === </w:t>
+      </w:r>
+      <w:proofErr w:type="spellStart"/>
+      <w:r>
+        <w:t>savedPass</w:t>
+      </w:r>
+      <w:proofErr w:type="spellEnd"/>
+      <w:r>
+        <w:t>) {</w:t>
+      </w:r>
+    </w:p>
+    <w:p/>
+    <w:p>
+      <w:r>
+        <w:t xml:space="preserve">        </w:t>
+      </w:r>
+      <w:proofErr w:type="gramStart"/>
+      <w:r>
+        <w:t>console.log(</w:t>
+      </w:r>
+      <w:proofErr w:type="gramEnd"/>
+      <w:r>
+        <w:t xml:space="preserve">"Typing:", </w:t>
+      </w:r>
+      <w:proofErr w:type="spellStart"/>
+      <w:r>
+        <w:t>keyTimes</w:t>
+      </w:r>
+      <w:proofErr w:type="spellEnd"/>
+      <w:r>
+        <w:t>);</w:t>
       </w:r>
     </w:p>
     <w:p>
@@ -3664,36 +4550,497 @@
         <w:lastRenderedPageBreak/>
         <w:t xml:space="preserve">        </w:t>
       </w:r>
-      <w:proofErr w:type="spellStart"/>
-      <w:r>
-        <w:t>keyTimes.push</w:t>
-      </w:r>
-      <w:proofErr w:type="spellEnd"/>
-      <w:r>
-        <w:t>(</w:t>
-      </w:r>
-      <w:proofErr w:type="spellStart"/>
-      <w:proofErr w:type="gramStart"/>
-      <w:r>
-        <w:t>Date.now</w:t>
-      </w:r>
-      <w:proofErr w:type="spellEnd"/>
-      <w:r>
-        <w:t>(</w:t>
-      </w:r>
-      <w:proofErr w:type="gramEnd"/>
-      <w:r>
-        <w:t>));</w:t>
-      </w:r>
-    </w:p>
-    <w:p>
-      <w:r>
-        <w:t>    });</w:t>
-      </w:r>
-    </w:p>
-    <w:p>
-      <w:r>
-        <w:t>});</w:t>
+      <w:proofErr w:type="gramStart"/>
+      <w:r>
+        <w:t>console.log(</w:t>
+      </w:r>
+      <w:proofErr w:type="gramEnd"/>
+      <w:r>
+        <w:t xml:space="preserve">"Mouse:", </w:t>
+      </w:r>
+      <w:proofErr w:type="spellStart"/>
+      <w:r>
+        <w:t>mouseData</w:t>
+      </w:r>
+      <w:proofErr w:type="spellEnd"/>
+      <w:r>
+        <w:t>);</w:t>
+      </w:r>
+    </w:p>
+    <w:p/>
+    <w:p>
+      <w:r>
+        <w:t xml:space="preserve">        </w:t>
+      </w:r>
+      <w:proofErr w:type="gramStart"/>
+      <w:r>
+        <w:t>alert(</w:t>
+      </w:r>
+      <w:proofErr w:type="gramEnd"/>
+      <w:r>
+        <w:t xml:space="preserve">"Login successful </w:t>
+      </w:r>
+      <w:r>
+        <w:rPr>
+          <w:rFonts w:ascii="Segoe UI Emoji" w:hAnsi="Segoe UI Emoji" w:cs="Segoe UI Emoji"/>
+        </w:rPr>
+        <w:t>✅</w:t>
+      </w:r>
+      <w:r>
+        <w:t>");</w:t>
+      </w:r>
+    </w:p>
+    <w:p/>
+    <w:p>
+      <w:r>
+        <w:t xml:space="preserve">        // </w:t>
+      </w:r>
+      <w:r>
+        <w:rPr>
+          <w:rFonts w:ascii="Segoe UI Emoji" w:hAnsi="Segoe UI Emoji" w:cs="Segoe UI Emoji"/>
+        </w:rPr>
+        <w:t>✅</w:t>
+      </w:r>
+      <w:r>
+        <w:t xml:space="preserve"> FIX: define BEFORE fetch</w:t>
+      </w:r>
+    </w:p>
+    <w:p>
+      <w:r>
+        <w:t xml:space="preserve">        let </w:t>
+      </w:r>
+      <w:proofErr w:type="spellStart"/>
+      <w:r>
+        <w:t>safeKeyTimes</w:t>
+      </w:r>
+      <w:proofErr w:type="spellEnd"/>
+      <w:r>
+        <w:t xml:space="preserve"> = </w:t>
+      </w:r>
+      <w:proofErr w:type="spellStart"/>
+      <w:r>
+        <w:t>keyTimes.length</w:t>
+      </w:r>
+      <w:proofErr w:type="spellEnd"/>
+      <w:r>
+        <w:t xml:space="preserve"> &gt; </w:t>
+      </w:r>
+      <w:proofErr w:type="gramStart"/>
+      <w:r>
+        <w:t>1 ?</w:t>
+      </w:r>
+      <w:proofErr w:type="gramEnd"/>
+      <w:r>
+        <w:t xml:space="preserve"> </w:t>
+      </w:r>
+      <w:proofErr w:type="spellStart"/>
+      <w:proofErr w:type="gramStart"/>
+      <w:r>
+        <w:t>keyTimes</w:t>
+      </w:r>
+      <w:proofErr w:type="spellEnd"/>
+      <w:r>
+        <w:t xml:space="preserve"> :</w:t>
+      </w:r>
+      <w:proofErr w:type="gramEnd"/>
+      <w:r>
+        <w:t xml:space="preserve"> [1, 2];</w:t>
+      </w:r>
+    </w:p>
+    <w:p/>
+    <w:p>
+      <w:r>
+        <w:t xml:space="preserve">        </w:t>
+      </w:r>
+      <w:proofErr w:type="gramStart"/>
+      <w:r>
+        <w:t>fetch(</w:t>
+      </w:r>
+      <w:proofErr w:type="gramEnd"/>
+      <w:r>
+        <w:t>"/</w:t>
+      </w:r>
+      <w:proofErr w:type="spellStart"/>
+      <w:r>
+        <w:t>analyze</w:t>
+      </w:r>
+      <w:proofErr w:type="spellEnd"/>
+      <w:r>
+        <w:t>", {</w:t>
+      </w:r>
+    </w:p>
+    <w:p>
+      <w:r>
+        <w:t>                method: "POST",</w:t>
+      </w:r>
+    </w:p>
+    <w:p>
+      <w:r>
+        <w:t>                headers: {</w:t>
+      </w:r>
+    </w:p>
+    <w:p>
+      <w:r>
+        <w:t>                    "Content-Type": "application/</w:t>
+      </w:r>
+      <w:proofErr w:type="spellStart"/>
+      <w:r>
+        <w:t>json</w:t>
+      </w:r>
+      <w:proofErr w:type="spellEnd"/>
+      <w:r>
+        <w:t>"</w:t>
+      </w:r>
+    </w:p>
+    <w:p>
+      <w:r>
+        <w:t>                },</w:t>
+      </w:r>
+    </w:p>
+    <w:p>
+      <w:r>
+        <w:t xml:space="preserve">                body: </w:t>
+      </w:r>
+      <w:proofErr w:type="spellStart"/>
+      <w:r>
+        <w:t>JSON.stringify</w:t>
+      </w:r>
+      <w:proofErr w:type="spellEnd"/>
+      <w:r>
+        <w:t>({</w:t>
+      </w:r>
+    </w:p>
+    <w:p>
+      <w:r>
+        <w:t xml:space="preserve">                    </w:t>
+      </w:r>
+      <w:proofErr w:type="spellStart"/>
+      <w:r>
+        <w:t>keyTimes</w:t>
+      </w:r>
+      <w:proofErr w:type="spellEnd"/>
+      <w:r>
+        <w:t xml:space="preserve">: </w:t>
+      </w:r>
+      <w:proofErr w:type="spellStart"/>
+      <w:r>
+        <w:t>safeKeyTimes</w:t>
+      </w:r>
+      <w:proofErr w:type="spellEnd"/>
+    </w:p>
+    <w:p>
+      <w:r>
+        <w:t>                })</w:t>
+      </w:r>
+    </w:p>
+    <w:p>
+      <w:r>
+        <w:t>            })</w:t>
+      </w:r>
+    </w:p>
+    <w:p>
+      <w:r>
+        <w:t xml:space="preserve">            </w:t>
+      </w:r>
+      <w:proofErr w:type="gramStart"/>
+      <w:r>
+        <w:t>.then</w:t>
+      </w:r>
+      <w:proofErr w:type="gramEnd"/>
+      <w:r>
+        <w:t>(res =&gt; {</w:t>
+      </w:r>
+    </w:p>
+    <w:p>
+      <w:r>
+        <w:t xml:space="preserve">                if </w:t>
+      </w:r>
+      <w:proofErr w:type="gramStart"/>
+      <w:r>
+        <w:t>(!</w:t>
+      </w:r>
+      <w:proofErr w:type="spellStart"/>
+      <w:r>
+        <w:t>res</w:t>
+      </w:r>
+      <w:proofErr w:type="gramEnd"/>
+      <w:r>
+        <w:t>.ok</w:t>
+      </w:r>
+      <w:proofErr w:type="spellEnd"/>
+      <w:r>
+        <w:t>) {</w:t>
+      </w:r>
+    </w:p>
+    <w:p>
+      <w:r>
+        <w:t xml:space="preserve">                    throw new </w:t>
+      </w:r>
+      <w:proofErr w:type="gramStart"/>
+      <w:r>
+        <w:t>Error(</w:t>
+      </w:r>
+      <w:proofErr w:type="gramEnd"/>
+      <w:r>
+        <w:t>"Server error");</w:t>
+      </w:r>
+    </w:p>
+    <w:p>
+      <w:r>
+        <w:t>                }</w:t>
+      </w:r>
+    </w:p>
+    <w:p>
+      <w:r>
+        <w:t xml:space="preserve">                return </w:t>
+      </w:r>
+      <w:proofErr w:type="spellStart"/>
+      <w:proofErr w:type="gramStart"/>
+      <w:r>
+        <w:t>res.json</w:t>
+      </w:r>
+      <w:proofErr w:type="spellEnd"/>
+      <w:proofErr w:type="gramEnd"/>
+      <w:r>
+        <w:t>();</w:t>
+      </w:r>
+    </w:p>
+    <w:p>
+      <w:r>
+        <w:t>            })</w:t>
+      </w:r>
+    </w:p>
+    <w:p>
+      <w:r>
+        <w:t xml:space="preserve">            </w:t>
+      </w:r>
+      <w:proofErr w:type="gramStart"/>
+      <w:r>
+        <w:t>.then</w:t>
+      </w:r>
+      <w:proofErr w:type="gramEnd"/>
+      <w:r>
+        <w:t>(data =&gt; {</w:t>
+      </w:r>
+    </w:p>
+    <w:p>
+      <w:r>
+        <w:t xml:space="preserve">                </w:t>
+      </w:r>
+      <w:proofErr w:type="gramStart"/>
+      <w:r>
+        <w:t>console.log(</w:t>
+      </w:r>
+      <w:proofErr w:type="gramEnd"/>
+      <w:r>
+        <w:t>"Prediction:", data);</w:t>
+      </w:r>
+    </w:p>
+    <w:p/>
+    <w:p>
+      <w:r>
+        <w:t>                // Store result</w:t>
+      </w:r>
+    </w:p>
+    <w:p>
+      <w:r>
+        <w:t xml:space="preserve">                </w:t>
+      </w:r>
+      <w:proofErr w:type="spellStart"/>
+      <w:r>
+        <w:t>localStorage.setItem</w:t>
+      </w:r>
+      <w:proofErr w:type="spellEnd"/>
+      <w:r>
+        <w:t xml:space="preserve">("risk", </w:t>
+      </w:r>
+      <w:proofErr w:type="spellStart"/>
+      <w:proofErr w:type="gramStart"/>
+      <w:r>
+        <w:t>data.risk</w:t>
+      </w:r>
+      <w:proofErr w:type="spellEnd"/>
+      <w:proofErr w:type="gramEnd"/>
+      <w:r>
+        <w:t>);</w:t>
+      </w:r>
+    </w:p>
+    <w:p>
+      <w:r>
+        <w:t xml:space="preserve">                </w:t>
+      </w:r>
+      <w:proofErr w:type="spellStart"/>
+      <w:r>
+        <w:t>localStorage.setItem</w:t>
+      </w:r>
+      <w:proofErr w:type="spellEnd"/>
+      <w:r>
+        <w:t xml:space="preserve">("prediction", </w:t>
+      </w:r>
+      <w:proofErr w:type="spellStart"/>
+      <w:proofErr w:type="gramStart"/>
+      <w:r>
+        <w:t>data.prediction</w:t>
+      </w:r>
+      <w:proofErr w:type="spellEnd"/>
+      <w:proofErr w:type="gramEnd"/>
+      <w:r>
+        <w:t>);</w:t>
+      </w:r>
+    </w:p>
+    <w:p/>
+    <w:p>
+      <w:r>
+        <w:t>                // Redirect to dashboard</w:t>
+      </w:r>
+    </w:p>
+    <w:p>
+      <w:r>
+        <w:t xml:space="preserve">                </w:t>
+      </w:r>
+      <w:proofErr w:type="spellStart"/>
+      <w:proofErr w:type="gramStart"/>
+      <w:r>
+        <w:t>window.location</w:t>
+      </w:r>
+      <w:proofErr w:type="gramEnd"/>
+      <w:r>
+        <w:t>.href</w:t>
+      </w:r>
+      <w:proofErr w:type="spellEnd"/>
+      <w:r>
+        <w:t xml:space="preserve"> = "/dashboard";</w:t>
+      </w:r>
+    </w:p>
+    <w:p>
+      <w:r>
+        <w:lastRenderedPageBreak/>
+        <w:t>            })</w:t>
+      </w:r>
+    </w:p>
+    <w:p>
+      <w:r>
+        <w:t xml:space="preserve">            </w:t>
+      </w:r>
+      <w:proofErr w:type="gramStart"/>
+      <w:r>
+        <w:t>.catch</w:t>
+      </w:r>
+      <w:proofErr w:type="gramEnd"/>
+      <w:r>
+        <w:t>(err =&gt; {</w:t>
+      </w:r>
+    </w:p>
+    <w:p>
+      <w:r>
+        <w:t xml:space="preserve">                </w:t>
+      </w:r>
+      <w:proofErr w:type="spellStart"/>
+      <w:proofErr w:type="gramStart"/>
+      <w:r>
+        <w:t>console.error</w:t>
+      </w:r>
+      <w:proofErr w:type="spellEnd"/>
+      <w:proofErr w:type="gramEnd"/>
+      <w:r>
+        <w:t>("Error:", err);</w:t>
+      </w:r>
+    </w:p>
+    <w:p>
+      <w:r>
+        <w:t xml:space="preserve">                </w:t>
+      </w:r>
+      <w:proofErr w:type="gramStart"/>
+      <w:r>
+        <w:t>alert(</w:t>
+      </w:r>
+      <w:proofErr w:type="gramEnd"/>
+      <w:r>
+        <w:t xml:space="preserve">"Server error </w:t>
+      </w:r>
+      <w:r>
+        <w:rPr>
+          <w:rFonts w:ascii="Segoe UI Emoji" w:hAnsi="Segoe UI Emoji" w:cs="Segoe UI Emoji"/>
+        </w:rPr>
+        <w:t>⚠️</w:t>
+      </w:r>
+      <w:r>
+        <w:t>");</w:t>
+      </w:r>
+    </w:p>
+    <w:p>
+      <w:r>
+        <w:t>            });</w:t>
+      </w:r>
+    </w:p>
+    <w:p/>
+    <w:p>
+      <w:r>
+        <w:t>        // Reset data</w:t>
+      </w:r>
+    </w:p>
+    <w:p>
+      <w:r>
+        <w:t xml:space="preserve">        </w:t>
+      </w:r>
+      <w:proofErr w:type="spellStart"/>
+      <w:r>
+        <w:t>keyTimes</w:t>
+      </w:r>
+      <w:proofErr w:type="spellEnd"/>
+      <w:r>
+        <w:t xml:space="preserve"> = [];</w:t>
+      </w:r>
+    </w:p>
+    <w:p>
+      <w:r>
+        <w:t xml:space="preserve">        </w:t>
+      </w:r>
+      <w:proofErr w:type="spellStart"/>
+      <w:r>
+        <w:t>mouseData</w:t>
+      </w:r>
+      <w:proofErr w:type="spellEnd"/>
+      <w:r>
+        <w:t xml:space="preserve"> = [];</w:t>
+      </w:r>
+    </w:p>
+    <w:p/>
+    <w:p>
+      <w:r>
+        <w:t>    } else {</w:t>
+      </w:r>
+    </w:p>
+    <w:p>
+      <w:r>
+        <w:t xml:space="preserve">        </w:t>
+      </w:r>
+      <w:proofErr w:type="gramStart"/>
+      <w:r>
+        <w:t>alert(</w:t>
+      </w:r>
+      <w:proofErr w:type="gramEnd"/>
+      <w:r>
+        <w:t xml:space="preserve">"Invalid credentials </w:t>
+      </w:r>
+      <w:r>
+        <w:rPr>
+          <w:rFonts w:ascii="Segoe UI Emoji" w:hAnsi="Segoe UI Emoji" w:cs="Segoe UI Emoji"/>
+        </w:rPr>
+        <w:t>❌</w:t>
+      </w:r>
+      <w:r>
+        <w:t>");</w:t>
+      </w:r>
+    </w:p>
+    <w:p>
+      <w:r>
+        <w:t>    }</w:t>
+      </w:r>
+    </w:p>
+    <w:p>
+      <w:r>
+        <w:t>}</w:t>
       </w:r>
     </w:p>
     <w:p/>
@@ -3704,7 +5051,7 @@
     </w:p>
     <w:p>
       <w:r>
-        <w:t>// CAPTURE MOUSE</w:t>
+        <w:t>// SIGNUP FUNCTION</w:t>
       </w:r>
     </w:p>
     <w:p>
@@ -3713,10 +5060,49 @@
       </w:r>
     </w:p>
     <w:p>
-      <w:proofErr w:type="spellStart"/>
-      <w:proofErr w:type="gramStart"/>
-      <w:r>
-        <w:t>document.addEventListener</w:t>
+      <w:r>
+        <w:t xml:space="preserve">function </w:t>
+      </w:r>
+      <w:proofErr w:type="gramStart"/>
+      <w:r>
+        <w:t>signup(</w:t>
+      </w:r>
+      <w:proofErr w:type="gramEnd"/>
+      <w:r>
+        <w:t>) {</w:t>
+      </w:r>
+    </w:p>
+    <w:p>
+      <w:r>
+        <w:t xml:space="preserve">    let username = </w:t>
+      </w:r>
+      <w:proofErr w:type="spellStart"/>
+      <w:proofErr w:type="gramStart"/>
+      <w:r>
+        <w:t>document.querySelector</w:t>
+      </w:r>
+      <w:proofErr w:type="spellEnd"/>
+      <w:proofErr w:type="gramEnd"/>
+      <w:r>
+        <w:t>("#</w:t>
+      </w:r>
+      <w:proofErr w:type="spellStart"/>
+      <w:r>
+        <w:t>signupForm</w:t>
+      </w:r>
+      <w:proofErr w:type="spellEnd"/>
+      <w:r>
+        <w:t xml:space="preserve"> input").value;</w:t>
+      </w:r>
+    </w:p>
+    <w:p>
+      <w:r>
+        <w:t xml:space="preserve">    let password = </w:t>
+      </w:r>
+      <w:proofErr w:type="spellStart"/>
+      <w:proofErr w:type="gramStart"/>
+      <w:r>
+        <w:t>document.getElementById</w:t>
       </w:r>
       <w:proofErr w:type="spellEnd"/>
       <w:proofErr w:type="gramEnd"/>
@@ -3725,90 +5111,91 @@
       </w:r>
       <w:proofErr w:type="spellStart"/>
       <w:r>
-        <w:t>mousemove</w:t>
-      </w:r>
-      <w:proofErr w:type="spellEnd"/>
-      <w:r>
-        <w:t>", (e) =&gt; {</w:t>
-      </w:r>
-    </w:p>
+        <w:t>signupPassword</w:t>
+      </w:r>
+      <w:proofErr w:type="spellEnd"/>
+      <w:r>
+        <w:t>").value;</w:t>
+      </w:r>
+    </w:p>
+    <w:p>
+      <w:r>
+        <w:t xml:space="preserve">    let </w:t>
+      </w:r>
+      <w:proofErr w:type="spellStart"/>
+      <w:r>
+        <w:t>confirmPassword</w:t>
+      </w:r>
+      <w:proofErr w:type="spellEnd"/>
+      <w:r>
+        <w:t xml:space="preserve"> = </w:t>
+      </w:r>
+      <w:proofErr w:type="spellStart"/>
+      <w:proofErr w:type="gramStart"/>
+      <w:r>
+        <w:t>document.getElementById</w:t>
+      </w:r>
+      <w:proofErr w:type="spellEnd"/>
+      <w:proofErr w:type="gramEnd"/>
+      <w:r>
+        <w:t>("</w:t>
+      </w:r>
+      <w:proofErr w:type="spellStart"/>
+      <w:r>
+        <w:t>confirmPassword</w:t>
+      </w:r>
+      <w:proofErr w:type="spellEnd"/>
+      <w:r>
+        <w:t>").value;</w:t>
+      </w:r>
+    </w:p>
+    <w:p/>
     <w:p>
       <w:r>
         <w:t>    if (</w:t>
       </w:r>
-      <w:proofErr w:type="spellStart"/>
-      <w:r>
-        <w:t>mouseData.length</w:t>
-      </w:r>
-      <w:proofErr w:type="spellEnd"/>
-      <w:r>
-        <w:t xml:space="preserve"> &lt; 100) {</w:t>
+      <w:proofErr w:type="gramStart"/>
+      <w:r>
+        <w:t>password !</w:t>
+      </w:r>
+      <w:proofErr w:type="gramEnd"/>
+      <w:r>
+        <w:t xml:space="preserve">== </w:t>
+      </w:r>
+      <w:proofErr w:type="spellStart"/>
+      <w:r>
+        <w:t>confirmPassword</w:t>
+      </w:r>
+      <w:proofErr w:type="spellEnd"/>
+      <w:r>
+        <w:t>) {</w:t>
       </w:r>
     </w:p>
     <w:p>
       <w:r>
         <w:t xml:space="preserve">        </w:t>
       </w:r>
-      <w:proofErr w:type="spellStart"/>
-      <w:r>
-        <w:t>mouseData.push</w:t>
-      </w:r>
-      <w:proofErr w:type="spellEnd"/>
-      <w:r>
-        <w:t>({</w:t>
-      </w:r>
-    </w:p>
-    <w:p>
-      <w:r>
-        <w:t xml:space="preserve">            x: </w:t>
-      </w:r>
-      <w:proofErr w:type="spellStart"/>
-      <w:proofErr w:type="gramStart"/>
-      <w:r>
-        <w:t>e.clientX</w:t>
-      </w:r>
-      <w:proofErr w:type="spellEnd"/>
-      <w:proofErr w:type="gramEnd"/>
-      <w:r>
-        <w:t>,</w:t>
-      </w:r>
-    </w:p>
-    <w:p>
-      <w:r>
-        <w:t xml:space="preserve">            y: </w:t>
-      </w:r>
-      <w:proofErr w:type="spellStart"/>
-      <w:proofErr w:type="gramStart"/>
-      <w:r>
-        <w:t>e.clientY</w:t>
-      </w:r>
-      <w:proofErr w:type="spellEnd"/>
-      <w:proofErr w:type="gramEnd"/>
-      <w:r>
-        <w:t>,</w:t>
-      </w:r>
-    </w:p>
-    <w:p>
-      <w:r>
-        <w:t xml:space="preserve">            time: </w:t>
-      </w:r>
-      <w:proofErr w:type="spellStart"/>
-      <w:proofErr w:type="gramStart"/>
-      <w:r>
-        <w:t>Date.now</w:t>
-      </w:r>
-      <w:proofErr w:type="spellEnd"/>
-      <w:r>
-        <w:t>(</w:t>
-      </w:r>
-      <w:proofErr w:type="gramEnd"/>
-      <w:r>
-        <w:t>)</w:t>
-      </w:r>
-    </w:p>
-    <w:p>
-      <w:r>
-        <w:t>        });</w:t>
+      <w:proofErr w:type="gramStart"/>
+      <w:r>
+        <w:t>alert(</w:t>
+      </w:r>
+      <w:proofErr w:type="gramEnd"/>
+      <w:r>
+        <w:t xml:space="preserve">"Passwords do not match </w:t>
+      </w:r>
+      <w:r>
+        <w:rPr>
+          <w:rFonts w:ascii="Segoe UI Emoji" w:hAnsi="Segoe UI Emoji" w:cs="Segoe UI Emoji"/>
+        </w:rPr>
+        <w:t>❌</w:t>
+      </w:r>
+      <w:r>
+        <w:t>");</w:t>
+      </w:r>
+    </w:p>
+    <w:p>
+      <w:r>
+        <w:t>        return;</w:t>
       </w:r>
     </w:p>
     <w:p>
@@ -3816,82 +5203,18 @@
         <w:t>    }</w:t>
       </w:r>
     </w:p>
-    <w:p>
-      <w:r>
-        <w:t>});</w:t>
-      </w:r>
-    </w:p>
-    <w:p/>
-    <w:p>
-      <w:r>
-        <w:t>// =====================</w:t>
-      </w:r>
-    </w:p>
-    <w:p>
-      <w:r>
-        <w:t>// TOGGLE LOGIN / SIGNUP</w:t>
-      </w:r>
-    </w:p>
-    <w:p>
-      <w:r>
-        <w:t>// =====================</w:t>
-      </w:r>
-    </w:p>
-    <w:p>
-      <w:r>
-        <w:t xml:space="preserve">function </w:t>
-      </w:r>
-      <w:proofErr w:type="spellStart"/>
-      <w:proofErr w:type="gramStart"/>
-      <w:r>
-        <w:t>showLogin</w:t>
-      </w:r>
-      <w:proofErr w:type="spellEnd"/>
-      <w:r>
-        <w:t>(</w:t>
-      </w:r>
-      <w:proofErr w:type="gramEnd"/>
-      <w:r>
-        <w:t>) {</w:t>
-      </w:r>
-    </w:p>
+    <w:p/>
     <w:p>
       <w:r>
         <w:t xml:space="preserve">    </w:t>
       </w:r>
       <w:proofErr w:type="spellStart"/>
-      <w:proofErr w:type="gramStart"/>
-      <w:r>
-        <w:t>document.getElementById</w:t>
-      </w:r>
-      <w:proofErr w:type="spellEnd"/>
-      <w:proofErr w:type="gramEnd"/>
-      <w:r>
-        <w:t>("</w:t>
-      </w:r>
-      <w:proofErr w:type="spellStart"/>
-      <w:r>
-        <w:t>loginForm</w:t>
-      </w:r>
-      <w:proofErr w:type="spellEnd"/>
-      <w:r>
-        <w:t>"</w:t>
-      </w:r>
-      <w:proofErr w:type="gramStart"/>
-      <w:r>
-        <w:t>).</w:t>
-      </w:r>
-      <w:proofErr w:type="spellStart"/>
-      <w:r>
-        <w:t>style</w:t>
-      </w:r>
-      <w:proofErr w:type="gramEnd"/>
-      <w:r>
-        <w:t>.display</w:t>
-      </w:r>
-      <w:proofErr w:type="spellEnd"/>
-      <w:r>
-        <w:t xml:space="preserve"> = "block";</w:t>
+      <w:r>
+        <w:t>localStorage.setItem</w:t>
+      </w:r>
+      <w:proofErr w:type="spellEnd"/>
+      <w:r>
+        <w:t>("username", username);</w:t>
       </w:r>
     </w:p>
     <w:p>
@@ -3899,1305 +5222,18 @@
         <w:t xml:space="preserve">    </w:t>
       </w:r>
       <w:proofErr w:type="spellStart"/>
-      <w:proofErr w:type="gramStart"/>
-      <w:r>
-        <w:t>document.getElementById</w:t>
-      </w:r>
-      <w:proofErr w:type="spellEnd"/>
-      <w:proofErr w:type="gramEnd"/>
-      <w:r>
-        <w:t>("</w:t>
-      </w:r>
-      <w:proofErr w:type="spellStart"/>
-      <w:r>
-        <w:t>signupForm</w:t>
-      </w:r>
-      <w:proofErr w:type="spellEnd"/>
-      <w:r>
-        <w:t>"</w:t>
-      </w:r>
-      <w:proofErr w:type="gramStart"/>
-      <w:r>
-        <w:t>).</w:t>
-      </w:r>
-      <w:proofErr w:type="spellStart"/>
-      <w:r>
-        <w:t>style</w:t>
-      </w:r>
-      <w:proofErr w:type="gramEnd"/>
-      <w:r>
-        <w:t>.display</w:t>
-      </w:r>
-      <w:proofErr w:type="spellEnd"/>
-      <w:r>
-        <w:t xml:space="preserve"> = "none";</w:t>
-      </w:r>
-    </w:p>
-    <w:p/>
-    <w:p>
-      <w:r>
-        <w:t xml:space="preserve">    </w:t>
-      </w:r>
-      <w:proofErr w:type="spellStart"/>
-      <w:proofErr w:type="gramStart"/>
-      <w:r>
-        <w:t>document.getElementById</w:t>
-      </w:r>
-      <w:proofErr w:type="spellEnd"/>
-      <w:proofErr w:type="gramEnd"/>
-      <w:r>
-        <w:t>("</w:t>
-      </w:r>
-      <w:proofErr w:type="spellStart"/>
-      <w:r>
-        <w:t>loginTab</w:t>
-      </w:r>
-      <w:proofErr w:type="spellEnd"/>
-      <w:r>
-        <w:t>"</w:t>
-      </w:r>
-      <w:proofErr w:type="gramStart"/>
-      <w:r>
-        <w:t>).</w:t>
-      </w:r>
-      <w:proofErr w:type="spellStart"/>
-      <w:r>
-        <w:t>classList.add</w:t>
-      </w:r>
-      <w:proofErr w:type="spellEnd"/>
-      <w:proofErr w:type="gramEnd"/>
-      <w:r>
-        <w:t>("active");</w:t>
-      </w:r>
-    </w:p>
-    <w:p>
-      <w:r>
-        <w:t xml:space="preserve">    </w:t>
-      </w:r>
-      <w:proofErr w:type="spellStart"/>
-      <w:proofErr w:type="gramStart"/>
-      <w:r>
-        <w:t>document.getElementById</w:t>
-      </w:r>
-      <w:proofErr w:type="spellEnd"/>
-      <w:proofErr w:type="gramEnd"/>
-      <w:r>
-        <w:t>("</w:t>
-      </w:r>
-      <w:proofErr w:type="spellStart"/>
-      <w:r>
-        <w:t>signupTab</w:t>
-      </w:r>
-      <w:proofErr w:type="spellEnd"/>
-      <w:r>
-        <w:t>"</w:t>
-      </w:r>
-      <w:proofErr w:type="gramStart"/>
-      <w:r>
-        <w:t>).</w:t>
-      </w:r>
-      <w:proofErr w:type="spellStart"/>
-      <w:r>
-        <w:t>classList.remove</w:t>
-      </w:r>
-      <w:proofErr w:type="spellEnd"/>
-      <w:proofErr w:type="gramEnd"/>
-      <w:r>
-        <w:t>("active");</w:t>
-      </w:r>
-    </w:p>
-    <w:p/>
-    <w:p>
-      <w:r>
-        <w:t xml:space="preserve">    </w:t>
-      </w:r>
-      <w:proofErr w:type="spellStart"/>
-      <w:proofErr w:type="gramStart"/>
-      <w:r>
-        <w:t>document.querySelector</w:t>
-      </w:r>
-      <w:proofErr w:type="spellEnd"/>
-      <w:proofErr w:type="gramEnd"/>
-      <w:r>
-        <w:t>(</w:t>
-      </w:r>
-      <w:proofErr w:type="gramStart"/>
-      <w:r>
-        <w:t>".slider</w:t>
-      </w:r>
-      <w:proofErr w:type="gramEnd"/>
-      <w:r>
-        <w:t>"</w:t>
-      </w:r>
-      <w:proofErr w:type="gramStart"/>
-      <w:r>
-        <w:t>).</w:t>
-      </w:r>
-      <w:proofErr w:type="spellStart"/>
-      <w:r>
-        <w:t>style</w:t>
-      </w:r>
-      <w:proofErr w:type="gramEnd"/>
-      <w:r>
-        <w:t>.left</w:t>
-      </w:r>
-      <w:proofErr w:type="spellEnd"/>
-      <w:r>
-        <w:t xml:space="preserve"> = "0%";</w:t>
-      </w:r>
-    </w:p>
-    <w:p>
-      <w:r>
-        <w:t>}</w:t>
-      </w:r>
-    </w:p>
-    <w:p/>
-    <w:p>
-      <w:r>
-        <w:t xml:space="preserve">function </w:t>
-      </w:r>
-      <w:proofErr w:type="spellStart"/>
-      <w:proofErr w:type="gramStart"/>
-      <w:r>
-        <w:t>showSignup</w:t>
-      </w:r>
-      <w:proofErr w:type="spellEnd"/>
-      <w:r>
-        <w:t>(</w:t>
-      </w:r>
-      <w:proofErr w:type="gramEnd"/>
-      <w:r>
-        <w:t>) {</w:t>
-      </w:r>
-    </w:p>
+      <w:r>
+        <w:t>localStorage.setItem</w:t>
+      </w:r>
+      <w:proofErr w:type="spellEnd"/>
+      <w:r>
+        <w:t>("password", password);</w:t>
+      </w:r>
+    </w:p>
+    <w:p/>
     <w:p>
       <w:r>
         <w:lastRenderedPageBreak/>
-        <w:t xml:space="preserve">    </w:t>
-      </w:r>
-      <w:proofErr w:type="spellStart"/>
-      <w:proofErr w:type="gramStart"/>
-      <w:r>
-        <w:t>document.getElementById</w:t>
-      </w:r>
-      <w:proofErr w:type="spellEnd"/>
-      <w:proofErr w:type="gramEnd"/>
-      <w:r>
-        <w:t>("</w:t>
-      </w:r>
-      <w:proofErr w:type="spellStart"/>
-      <w:r>
-        <w:t>loginForm</w:t>
-      </w:r>
-      <w:proofErr w:type="spellEnd"/>
-      <w:r>
-        <w:t>"</w:t>
-      </w:r>
-      <w:proofErr w:type="gramStart"/>
-      <w:r>
-        <w:t>).</w:t>
-      </w:r>
-      <w:proofErr w:type="spellStart"/>
-      <w:r>
-        <w:t>style</w:t>
-      </w:r>
-      <w:proofErr w:type="gramEnd"/>
-      <w:r>
-        <w:t>.display</w:t>
-      </w:r>
-      <w:proofErr w:type="spellEnd"/>
-      <w:r>
-        <w:t xml:space="preserve"> = "none";</w:t>
-      </w:r>
-    </w:p>
-    <w:p>
-      <w:r>
-        <w:t xml:space="preserve">    </w:t>
-      </w:r>
-      <w:proofErr w:type="spellStart"/>
-      <w:proofErr w:type="gramStart"/>
-      <w:r>
-        <w:t>document.getElementById</w:t>
-      </w:r>
-      <w:proofErr w:type="spellEnd"/>
-      <w:proofErr w:type="gramEnd"/>
-      <w:r>
-        <w:t>("</w:t>
-      </w:r>
-      <w:proofErr w:type="spellStart"/>
-      <w:r>
-        <w:t>signupForm</w:t>
-      </w:r>
-      <w:proofErr w:type="spellEnd"/>
-      <w:r>
-        <w:t>"</w:t>
-      </w:r>
-      <w:proofErr w:type="gramStart"/>
-      <w:r>
-        <w:t>).</w:t>
-      </w:r>
-      <w:proofErr w:type="spellStart"/>
-      <w:r>
-        <w:t>style</w:t>
-      </w:r>
-      <w:proofErr w:type="gramEnd"/>
-      <w:r>
-        <w:t>.display</w:t>
-      </w:r>
-      <w:proofErr w:type="spellEnd"/>
-      <w:r>
-        <w:t xml:space="preserve"> = "block";</w:t>
-      </w:r>
-    </w:p>
-    <w:p/>
-    <w:p>
-      <w:r>
-        <w:t xml:space="preserve">    </w:t>
-      </w:r>
-      <w:proofErr w:type="spellStart"/>
-      <w:proofErr w:type="gramStart"/>
-      <w:r>
-        <w:t>document.getElementById</w:t>
-      </w:r>
-      <w:proofErr w:type="spellEnd"/>
-      <w:proofErr w:type="gramEnd"/>
-      <w:r>
-        <w:t>("</w:t>
-      </w:r>
-      <w:proofErr w:type="spellStart"/>
-      <w:r>
-        <w:t>signupTab</w:t>
-      </w:r>
-      <w:proofErr w:type="spellEnd"/>
-      <w:r>
-        <w:t>"</w:t>
-      </w:r>
-      <w:proofErr w:type="gramStart"/>
-      <w:r>
-        <w:t>).</w:t>
-      </w:r>
-      <w:proofErr w:type="spellStart"/>
-      <w:r>
-        <w:t>classList.add</w:t>
-      </w:r>
-      <w:proofErr w:type="spellEnd"/>
-      <w:proofErr w:type="gramEnd"/>
-      <w:r>
-        <w:t>("active");</w:t>
-      </w:r>
-    </w:p>
-    <w:p>
-      <w:r>
-        <w:t xml:space="preserve">    </w:t>
-      </w:r>
-      <w:proofErr w:type="spellStart"/>
-      <w:proofErr w:type="gramStart"/>
-      <w:r>
-        <w:t>document.getElementById</w:t>
-      </w:r>
-      <w:proofErr w:type="spellEnd"/>
-      <w:proofErr w:type="gramEnd"/>
-      <w:r>
-        <w:t>("</w:t>
-      </w:r>
-      <w:proofErr w:type="spellStart"/>
-      <w:r>
-        <w:t>loginTab</w:t>
-      </w:r>
-      <w:proofErr w:type="spellEnd"/>
-      <w:r>
-        <w:t>"</w:t>
-      </w:r>
-      <w:proofErr w:type="gramStart"/>
-      <w:r>
-        <w:t>).</w:t>
-      </w:r>
-      <w:proofErr w:type="spellStart"/>
-      <w:r>
-        <w:t>classList.remove</w:t>
-      </w:r>
-      <w:proofErr w:type="spellEnd"/>
-      <w:proofErr w:type="gramEnd"/>
-      <w:r>
-        <w:t>("active");</w:t>
-      </w:r>
-    </w:p>
-    <w:p/>
-    <w:p>
-      <w:r>
-        <w:t xml:space="preserve">    </w:t>
-      </w:r>
-      <w:proofErr w:type="spellStart"/>
-      <w:proofErr w:type="gramStart"/>
-      <w:r>
-        <w:t>document.querySelector</w:t>
-      </w:r>
-      <w:proofErr w:type="spellEnd"/>
-      <w:proofErr w:type="gramEnd"/>
-      <w:r>
-        <w:t>(</w:t>
-      </w:r>
-      <w:proofErr w:type="gramStart"/>
-      <w:r>
-        <w:t>".slider</w:t>
-      </w:r>
-      <w:proofErr w:type="gramEnd"/>
-      <w:r>
-        <w:t>"</w:t>
-      </w:r>
-      <w:proofErr w:type="gramStart"/>
-      <w:r>
-        <w:t>).</w:t>
-      </w:r>
-      <w:proofErr w:type="spellStart"/>
-      <w:r>
-        <w:t>style</w:t>
-      </w:r>
-      <w:proofErr w:type="gramEnd"/>
-      <w:r>
-        <w:t>.left</w:t>
-      </w:r>
-      <w:proofErr w:type="spellEnd"/>
-      <w:r>
-        <w:t xml:space="preserve"> = "50%";</w:t>
-      </w:r>
-    </w:p>
-    <w:p>
-      <w:r>
-        <w:t>}</w:t>
-      </w:r>
-    </w:p>
-    <w:p/>
-    <w:p>
-      <w:r>
-        <w:t>// =====================</w:t>
-      </w:r>
-    </w:p>
-    <w:p>
-      <w:r>
-        <w:t>// TOGGLE PASSWORD</w:t>
-      </w:r>
-    </w:p>
-    <w:p>
-      <w:r>
-        <w:t>// =====================</w:t>
-      </w:r>
-    </w:p>
-    <w:p>
-      <w:r>
-        <w:t xml:space="preserve">function </w:t>
-      </w:r>
-      <w:proofErr w:type="spellStart"/>
-      <w:r>
-        <w:t>togglePassword</w:t>
-      </w:r>
-      <w:proofErr w:type="spellEnd"/>
-      <w:r>
-        <w:t>(id) {</w:t>
-      </w:r>
-    </w:p>
-    <w:p>
-      <w:r>
-        <w:t xml:space="preserve">    let input = </w:t>
-      </w:r>
-      <w:proofErr w:type="spellStart"/>
-      <w:proofErr w:type="gramStart"/>
-      <w:r>
-        <w:t>document.getElementById</w:t>
-      </w:r>
-      <w:proofErr w:type="spellEnd"/>
-      <w:proofErr w:type="gramEnd"/>
-      <w:r>
-        <w:t>(id);</w:t>
-      </w:r>
-    </w:p>
-    <w:p>
-      <w:r>
-        <w:t xml:space="preserve">    </w:t>
-      </w:r>
-      <w:proofErr w:type="spellStart"/>
-      <w:proofErr w:type="gramStart"/>
-      <w:r>
-        <w:t>input.type</w:t>
-      </w:r>
-      <w:proofErr w:type="spellEnd"/>
-      <w:proofErr w:type="gramEnd"/>
-      <w:r>
-        <w:t xml:space="preserve"> = </w:t>
-      </w:r>
-      <w:proofErr w:type="spellStart"/>
-      <w:proofErr w:type="gramStart"/>
-      <w:r>
-        <w:t>input.type</w:t>
-      </w:r>
-      <w:proofErr w:type="spellEnd"/>
-      <w:proofErr w:type="gramEnd"/>
-      <w:r>
-        <w:t xml:space="preserve"> === "password</w:t>
-      </w:r>
-      <w:proofErr w:type="gramStart"/>
-      <w:r>
-        <w:t>" ?</w:t>
-      </w:r>
-      <w:proofErr w:type="gramEnd"/>
-      <w:r>
-        <w:t xml:space="preserve"> "text</w:t>
-      </w:r>
-      <w:proofErr w:type="gramStart"/>
-      <w:r>
-        <w:t>" :</w:t>
-      </w:r>
-      <w:proofErr w:type="gramEnd"/>
-      <w:r>
-        <w:t xml:space="preserve"> "password";</w:t>
-      </w:r>
-    </w:p>
-    <w:p>
-      <w:r>
-        <w:t>}</w:t>
-      </w:r>
-    </w:p>
-    <w:p/>
-    <w:p>
-      <w:r>
-        <w:t>// =====================</w:t>
-      </w:r>
-    </w:p>
-    <w:p>
-      <w:r>
-        <w:t>// LOGIN FUNCTION (FIXED)</w:t>
-      </w:r>
-    </w:p>
-    <w:p>
-      <w:r>
-        <w:t>// =====================</w:t>
-      </w:r>
-    </w:p>
-    <w:p>
-      <w:r>
-        <w:t xml:space="preserve">function </w:t>
-      </w:r>
-      <w:proofErr w:type="gramStart"/>
-      <w:r>
-        <w:t>login(</w:t>
-      </w:r>
-      <w:proofErr w:type="gramEnd"/>
-      <w:r>
-        <w:t>) {</w:t>
-      </w:r>
-    </w:p>
-    <w:p>
-      <w:r>
-        <w:t xml:space="preserve">    let username = </w:t>
-      </w:r>
-      <w:proofErr w:type="spellStart"/>
-      <w:proofErr w:type="gramStart"/>
-      <w:r>
-        <w:t>document.querySelector</w:t>
-      </w:r>
-      <w:proofErr w:type="spellEnd"/>
-      <w:proofErr w:type="gramEnd"/>
-      <w:r>
-        <w:t>("#</w:t>
-      </w:r>
-      <w:proofErr w:type="spellStart"/>
-      <w:r>
-        <w:t>loginForm</w:t>
-      </w:r>
-      <w:proofErr w:type="spellEnd"/>
-      <w:r>
-        <w:t xml:space="preserve"> input").value;</w:t>
-      </w:r>
-    </w:p>
-    <w:p>
-      <w:r>
-        <w:t xml:space="preserve">    let password = </w:t>
-      </w:r>
-      <w:proofErr w:type="spellStart"/>
-      <w:proofErr w:type="gramStart"/>
-      <w:r>
-        <w:t>document.getElementById</w:t>
-      </w:r>
-      <w:proofErr w:type="spellEnd"/>
-      <w:proofErr w:type="gramEnd"/>
-      <w:r>
-        <w:t>("password").value;</w:t>
-      </w:r>
-    </w:p>
-    <w:p/>
-    <w:p>
-      <w:r>
-        <w:t xml:space="preserve">    let </w:t>
-      </w:r>
-      <w:proofErr w:type="spellStart"/>
-      <w:r>
-        <w:t>savedUser</w:t>
-      </w:r>
-      <w:proofErr w:type="spellEnd"/>
-      <w:r>
-        <w:t xml:space="preserve"> = </w:t>
-      </w:r>
-      <w:proofErr w:type="spellStart"/>
-      <w:r>
-        <w:t>localStorage.getItem</w:t>
-      </w:r>
-      <w:proofErr w:type="spellEnd"/>
-      <w:r>
-        <w:t>("username");</w:t>
-      </w:r>
-    </w:p>
-    <w:p>
-      <w:r>
-        <w:t xml:space="preserve">    let </w:t>
-      </w:r>
-      <w:proofErr w:type="spellStart"/>
-      <w:r>
-        <w:t>savedPass</w:t>
-      </w:r>
-      <w:proofErr w:type="spellEnd"/>
-      <w:r>
-        <w:t xml:space="preserve"> = </w:t>
-      </w:r>
-      <w:proofErr w:type="spellStart"/>
-      <w:r>
-        <w:t>localStorage.getItem</w:t>
-      </w:r>
-      <w:proofErr w:type="spellEnd"/>
-      <w:r>
-        <w:t>("password");</w:t>
-      </w:r>
-    </w:p>
-    <w:p/>
-    <w:p>
-      <w:r>
-        <w:t xml:space="preserve">    if (username === </w:t>
-      </w:r>
-      <w:proofErr w:type="spellStart"/>
-      <w:r>
-        <w:t>savedUser</w:t>
-      </w:r>
-      <w:proofErr w:type="spellEnd"/>
-      <w:r>
-        <w:t xml:space="preserve"> &amp;&amp; password === </w:t>
-      </w:r>
-      <w:proofErr w:type="spellStart"/>
-      <w:r>
-        <w:t>savedPass</w:t>
-      </w:r>
-      <w:proofErr w:type="spellEnd"/>
-      <w:r>
-        <w:t>) {</w:t>
-      </w:r>
-    </w:p>
-    <w:p/>
-    <w:p>
-      <w:r>
-        <w:t xml:space="preserve">        </w:t>
-      </w:r>
-      <w:proofErr w:type="gramStart"/>
-      <w:r>
-        <w:t>console.log(</w:t>
-      </w:r>
-      <w:proofErr w:type="gramEnd"/>
-      <w:r>
-        <w:t xml:space="preserve">"Typing:", </w:t>
-      </w:r>
-      <w:proofErr w:type="spellStart"/>
-      <w:r>
-        <w:t>keyTimes</w:t>
-      </w:r>
-      <w:proofErr w:type="spellEnd"/>
-      <w:r>
-        <w:t>);</w:t>
-      </w:r>
-    </w:p>
-    <w:p>
-      <w:r>
-        <w:t xml:space="preserve">        </w:t>
-      </w:r>
-      <w:proofErr w:type="gramStart"/>
-      <w:r>
-        <w:t>console.log(</w:t>
-      </w:r>
-      <w:proofErr w:type="gramEnd"/>
-      <w:r>
-        <w:t xml:space="preserve">"Mouse:", </w:t>
-      </w:r>
-      <w:proofErr w:type="spellStart"/>
-      <w:r>
-        <w:t>mouseData</w:t>
-      </w:r>
-      <w:proofErr w:type="spellEnd"/>
-      <w:r>
-        <w:t>);</w:t>
-      </w:r>
-    </w:p>
-    <w:p/>
-    <w:p>
-      <w:r>
-        <w:t xml:space="preserve">        </w:t>
-      </w:r>
-      <w:proofErr w:type="gramStart"/>
-      <w:r>
-        <w:t>alert(</w:t>
-      </w:r>
-      <w:proofErr w:type="gramEnd"/>
-      <w:r>
-        <w:t xml:space="preserve">"Login successful </w:t>
-      </w:r>
-      <w:r>
-        <w:rPr>
-          <w:rFonts w:ascii="Segoe UI Emoji" w:hAnsi="Segoe UI Emoji" w:cs="Segoe UI Emoji"/>
-        </w:rPr>
-        <w:t>✅</w:t>
-      </w:r>
-      <w:r>
-        <w:t>");</w:t>
-      </w:r>
-    </w:p>
-    <w:p/>
-    <w:p>
-      <w:r>
-        <w:t xml:space="preserve">        // </w:t>
-      </w:r>
-      <w:r>
-        <w:rPr>
-          <w:rFonts w:ascii="Segoe UI Emoji" w:hAnsi="Segoe UI Emoji" w:cs="Segoe UI Emoji"/>
-        </w:rPr>
-        <w:t>✅</w:t>
-      </w:r>
-      <w:r>
-        <w:t xml:space="preserve"> FIX: define BEFORE fetch</w:t>
-      </w:r>
-    </w:p>
-    <w:p>
-      <w:r>
-        <w:t xml:space="preserve">        let </w:t>
-      </w:r>
-      <w:proofErr w:type="spellStart"/>
-      <w:r>
-        <w:t>safeKeyTimes</w:t>
-      </w:r>
-      <w:proofErr w:type="spellEnd"/>
-      <w:r>
-        <w:t xml:space="preserve"> = </w:t>
-      </w:r>
-      <w:proofErr w:type="spellStart"/>
-      <w:r>
-        <w:t>keyTimes.length</w:t>
-      </w:r>
-      <w:proofErr w:type="spellEnd"/>
-      <w:r>
-        <w:t xml:space="preserve"> &gt; </w:t>
-      </w:r>
-      <w:proofErr w:type="gramStart"/>
-      <w:r>
-        <w:t>1 ?</w:t>
-      </w:r>
-      <w:proofErr w:type="gramEnd"/>
-      <w:r>
-        <w:t xml:space="preserve"> </w:t>
-      </w:r>
-      <w:proofErr w:type="spellStart"/>
-      <w:proofErr w:type="gramStart"/>
-      <w:r>
-        <w:t>keyTimes</w:t>
-      </w:r>
-      <w:proofErr w:type="spellEnd"/>
-      <w:r>
-        <w:t xml:space="preserve"> :</w:t>
-      </w:r>
-      <w:proofErr w:type="gramEnd"/>
-      <w:r>
-        <w:t xml:space="preserve"> [1, 2];</w:t>
-      </w:r>
-    </w:p>
-    <w:p/>
-    <w:p>
-      <w:r>
-        <w:t xml:space="preserve">        </w:t>
-      </w:r>
-      <w:proofErr w:type="gramStart"/>
-      <w:r>
-        <w:t>fetch(</w:t>
-      </w:r>
-      <w:proofErr w:type="gramEnd"/>
-      <w:r>
-        <w:t>"/</w:t>
-      </w:r>
-      <w:proofErr w:type="spellStart"/>
-      <w:r>
-        <w:t>analyze</w:t>
-      </w:r>
-      <w:proofErr w:type="spellEnd"/>
-      <w:r>
-        <w:t>", {</w:t>
-      </w:r>
-    </w:p>
-    <w:p>
-      <w:r>
-        <w:t>                method: "POST",</w:t>
-      </w:r>
-    </w:p>
-    <w:p>
-      <w:r>
-        <w:t>                headers: {</w:t>
-      </w:r>
-    </w:p>
-    <w:p>
-      <w:r>
-        <w:t>                    "Content-Type": "application/</w:t>
-      </w:r>
-      <w:proofErr w:type="spellStart"/>
-      <w:r>
-        <w:t>json</w:t>
-      </w:r>
-      <w:proofErr w:type="spellEnd"/>
-      <w:r>
-        <w:t>"</w:t>
-      </w:r>
-    </w:p>
-    <w:p>
-      <w:r>
-        <w:t>                },</w:t>
-      </w:r>
-    </w:p>
-    <w:p>
-      <w:r>
-        <w:t xml:space="preserve">                body: </w:t>
-      </w:r>
-      <w:proofErr w:type="spellStart"/>
-      <w:r>
-        <w:t>JSON.stringify</w:t>
-      </w:r>
-      <w:proofErr w:type="spellEnd"/>
-      <w:r>
-        <w:t>({</w:t>
-      </w:r>
-    </w:p>
-    <w:p>
-      <w:r>
-        <w:t xml:space="preserve">                    </w:t>
-      </w:r>
-      <w:proofErr w:type="spellStart"/>
-      <w:r>
-        <w:t>keyTimes</w:t>
-      </w:r>
-      <w:proofErr w:type="spellEnd"/>
-      <w:r>
-        <w:t xml:space="preserve">: </w:t>
-      </w:r>
-      <w:proofErr w:type="spellStart"/>
-      <w:r>
-        <w:t>safeKeyTimes</w:t>
-      </w:r>
-      <w:proofErr w:type="spellEnd"/>
-    </w:p>
-    <w:p>
-      <w:r>
-        <w:t>                })</w:t>
-      </w:r>
-    </w:p>
-    <w:p>
-      <w:r>
-        <w:t>            })</w:t>
-      </w:r>
-    </w:p>
-    <w:p>
-      <w:r>
-        <w:t xml:space="preserve">            </w:t>
-      </w:r>
-      <w:proofErr w:type="gramStart"/>
-      <w:r>
-        <w:t>.then</w:t>
-      </w:r>
-      <w:proofErr w:type="gramEnd"/>
-      <w:r>
-        <w:t>(res =&gt; {</w:t>
-      </w:r>
-    </w:p>
-    <w:p>
-      <w:r>
-        <w:t xml:space="preserve">                if </w:t>
-      </w:r>
-      <w:proofErr w:type="gramStart"/>
-      <w:r>
-        <w:t>(!</w:t>
-      </w:r>
-      <w:proofErr w:type="spellStart"/>
-      <w:r>
-        <w:t>res</w:t>
-      </w:r>
-      <w:proofErr w:type="gramEnd"/>
-      <w:r>
-        <w:t>.ok</w:t>
-      </w:r>
-      <w:proofErr w:type="spellEnd"/>
-      <w:r>
-        <w:t>) {</w:t>
-      </w:r>
-    </w:p>
-    <w:p>
-      <w:r>
-        <w:t xml:space="preserve">                    throw new </w:t>
-      </w:r>
-      <w:proofErr w:type="gramStart"/>
-      <w:r>
-        <w:t>Error(</w:t>
-      </w:r>
-      <w:proofErr w:type="gramEnd"/>
-      <w:r>
-        <w:t>"Server error");</w:t>
-      </w:r>
-    </w:p>
-    <w:p>
-      <w:r>
-        <w:t>                }</w:t>
-      </w:r>
-    </w:p>
-    <w:p>
-      <w:r>
-        <w:t xml:space="preserve">                return </w:t>
-      </w:r>
-      <w:proofErr w:type="spellStart"/>
-      <w:proofErr w:type="gramStart"/>
-      <w:r>
-        <w:t>res.json</w:t>
-      </w:r>
-      <w:proofErr w:type="spellEnd"/>
-      <w:proofErr w:type="gramEnd"/>
-      <w:r>
-        <w:t>();</w:t>
-      </w:r>
-    </w:p>
-    <w:p>
-      <w:r>
-        <w:t>            })</w:t>
-      </w:r>
-    </w:p>
-    <w:p>
-      <w:r>
-        <w:t xml:space="preserve">            </w:t>
-      </w:r>
-      <w:proofErr w:type="gramStart"/>
-      <w:r>
-        <w:t>.then</w:t>
-      </w:r>
-      <w:proofErr w:type="gramEnd"/>
-      <w:r>
-        <w:t>(data =&gt; {</w:t>
-      </w:r>
-    </w:p>
-    <w:p>
-      <w:r>
-        <w:t xml:space="preserve">                </w:t>
-      </w:r>
-      <w:proofErr w:type="gramStart"/>
-      <w:r>
-        <w:t>console.log(</w:t>
-      </w:r>
-      <w:proofErr w:type="gramEnd"/>
-      <w:r>
-        <w:t>"Prediction:", data);</w:t>
-      </w:r>
-    </w:p>
-    <w:p/>
-    <w:p>
-      <w:r>
-        <w:t>                // Store result</w:t>
-      </w:r>
-    </w:p>
-    <w:p>
-      <w:r>
-        <w:t xml:space="preserve">                </w:t>
-      </w:r>
-      <w:proofErr w:type="spellStart"/>
-      <w:r>
-        <w:t>localStorage.setItem</w:t>
-      </w:r>
-      <w:proofErr w:type="spellEnd"/>
-      <w:r>
-        <w:t xml:space="preserve">("risk", </w:t>
-      </w:r>
-      <w:proofErr w:type="spellStart"/>
-      <w:proofErr w:type="gramStart"/>
-      <w:r>
-        <w:t>data.risk</w:t>
-      </w:r>
-      <w:proofErr w:type="spellEnd"/>
-      <w:proofErr w:type="gramEnd"/>
-      <w:r>
-        <w:t>);</w:t>
-      </w:r>
-    </w:p>
-    <w:p>
-      <w:r>
-        <w:t xml:space="preserve">                </w:t>
-      </w:r>
-      <w:proofErr w:type="spellStart"/>
-      <w:r>
-        <w:t>localStorage.setItem</w:t>
-      </w:r>
-      <w:proofErr w:type="spellEnd"/>
-      <w:r>
-        <w:t xml:space="preserve">("prediction", </w:t>
-      </w:r>
-      <w:proofErr w:type="spellStart"/>
-      <w:proofErr w:type="gramStart"/>
-      <w:r>
-        <w:t>data.prediction</w:t>
-      </w:r>
-      <w:proofErr w:type="spellEnd"/>
-      <w:proofErr w:type="gramEnd"/>
-      <w:r>
-        <w:t>);</w:t>
-      </w:r>
-    </w:p>
-    <w:p/>
-    <w:p>
-      <w:r>
-        <w:t>                // Redirect to dashboard</w:t>
-      </w:r>
-    </w:p>
-    <w:p>
-      <w:r>
-        <w:t xml:space="preserve">                </w:t>
-      </w:r>
-      <w:proofErr w:type="spellStart"/>
-      <w:proofErr w:type="gramStart"/>
-      <w:r>
-        <w:t>window.location</w:t>
-      </w:r>
-      <w:proofErr w:type="gramEnd"/>
-      <w:r>
-        <w:t>.href</w:t>
-      </w:r>
-      <w:proofErr w:type="spellEnd"/>
-      <w:r>
-        <w:t xml:space="preserve"> = "/dashboard";</w:t>
-      </w:r>
-    </w:p>
-    <w:p>
-      <w:r>
-        <w:t>            })</w:t>
-      </w:r>
-    </w:p>
-    <w:p>
-      <w:r>
-        <w:lastRenderedPageBreak/>
-        <w:t xml:space="preserve">            </w:t>
-      </w:r>
-      <w:proofErr w:type="gramStart"/>
-      <w:r>
-        <w:t>.catch</w:t>
-      </w:r>
-      <w:proofErr w:type="gramEnd"/>
-      <w:r>
-        <w:t>(err =&gt; {</w:t>
-      </w:r>
-    </w:p>
-    <w:p>
-      <w:r>
-        <w:t xml:space="preserve">                </w:t>
-      </w:r>
-      <w:proofErr w:type="spellStart"/>
-      <w:proofErr w:type="gramStart"/>
-      <w:r>
-        <w:t>console.error</w:t>
-      </w:r>
-      <w:proofErr w:type="spellEnd"/>
-      <w:proofErr w:type="gramEnd"/>
-      <w:r>
-        <w:t>("Error:", err);</w:t>
-      </w:r>
-    </w:p>
-    <w:p>
-      <w:r>
-        <w:t xml:space="preserve">                </w:t>
-      </w:r>
-      <w:proofErr w:type="gramStart"/>
-      <w:r>
-        <w:t>alert(</w:t>
-      </w:r>
-      <w:proofErr w:type="gramEnd"/>
-      <w:r>
-        <w:t xml:space="preserve">"Server error </w:t>
-      </w:r>
-      <w:r>
-        <w:rPr>
-          <w:rFonts w:ascii="Segoe UI Emoji" w:hAnsi="Segoe UI Emoji" w:cs="Segoe UI Emoji"/>
-        </w:rPr>
-        <w:t>⚠️</w:t>
-      </w:r>
-      <w:r>
-        <w:t>");</w:t>
-      </w:r>
-    </w:p>
-    <w:p>
-      <w:r>
-        <w:t>            });</w:t>
-      </w:r>
-    </w:p>
-    <w:p/>
-    <w:p>
-      <w:r>
-        <w:t>        // Reset data</w:t>
-      </w:r>
-    </w:p>
-    <w:p>
-      <w:r>
-        <w:t xml:space="preserve">        </w:t>
-      </w:r>
-      <w:proofErr w:type="spellStart"/>
-      <w:r>
-        <w:t>keyTimes</w:t>
-      </w:r>
-      <w:proofErr w:type="spellEnd"/>
-      <w:r>
-        <w:t xml:space="preserve"> = [];</w:t>
-      </w:r>
-    </w:p>
-    <w:p>
-      <w:r>
-        <w:t xml:space="preserve">        </w:t>
-      </w:r>
-      <w:proofErr w:type="spellStart"/>
-      <w:r>
-        <w:t>mouseData</w:t>
-      </w:r>
-      <w:proofErr w:type="spellEnd"/>
-      <w:r>
-        <w:t xml:space="preserve"> = [];</w:t>
-      </w:r>
-    </w:p>
-    <w:p/>
-    <w:p>
-      <w:r>
-        <w:t>    } else {</w:t>
-      </w:r>
-    </w:p>
-    <w:p>
-      <w:r>
-        <w:t xml:space="preserve">        </w:t>
-      </w:r>
-      <w:proofErr w:type="gramStart"/>
-      <w:r>
-        <w:t>alert(</w:t>
-      </w:r>
-      <w:proofErr w:type="gramEnd"/>
-      <w:r>
-        <w:t xml:space="preserve">"Invalid credentials </w:t>
-      </w:r>
-      <w:r>
-        <w:rPr>
-          <w:rFonts w:ascii="Segoe UI Emoji" w:hAnsi="Segoe UI Emoji" w:cs="Segoe UI Emoji"/>
-        </w:rPr>
-        <w:t>❌</w:t>
-      </w:r>
-      <w:r>
-        <w:t>");</w:t>
-      </w:r>
-    </w:p>
-    <w:p>
-      <w:r>
-        <w:t>    }</w:t>
-      </w:r>
-    </w:p>
-    <w:p>
-      <w:r>
-        <w:t>}</w:t>
-      </w:r>
-    </w:p>
-    <w:p/>
-    <w:p>
-      <w:r>
-        <w:t>// =====================</w:t>
-      </w:r>
-    </w:p>
-    <w:p>
-      <w:r>
-        <w:t>// SIGNUP FUNCTION</w:t>
-      </w:r>
-    </w:p>
-    <w:p>
-      <w:r>
-        <w:t>// =====================</w:t>
-      </w:r>
-    </w:p>
-    <w:p>
-      <w:r>
-        <w:t xml:space="preserve">function </w:t>
-      </w:r>
-      <w:proofErr w:type="gramStart"/>
-      <w:r>
-        <w:t>signup(</w:t>
-      </w:r>
-      <w:proofErr w:type="gramEnd"/>
-      <w:r>
-        <w:t>) {</w:t>
-      </w:r>
-    </w:p>
-    <w:p>
-      <w:r>
-        <w:t xml:space="preserve">    let username = </w:t>
-      </w:r>
-      <w:proofErr w:type="spellStart"/>
-      <w:proofErr w:type="gramStart"/>
-      <w:r>
-        <w:t>document.querySelector</w:t>
-      </w:r>
-      <w:proofErr w:type="spellEnd"/>
-      <w:proofErr w:type="gramEnd"/>
-      <w:r>
-        <w:t>("#</w:t>
-      </w:r>
-      <w:proofErr w:type="spellStart"/>
-      <w:r>
-        <w:t>signupForm</w:t>
-      </w:r>
-      <w:proofErr w:type="spellEnd"/>
-      <w:r>
-        <w:t xml:space="preserve"> input").value;</w:t>
-      </w:r>
-    </w:p>
-    <w:p>
-      <w:r>
-        <w:t xml:space="preserve">    let password = </w:t>
-      </w:r>
-      <w:proofErr w:type="spellStart"/>
-      <w:proofErr w:type="gramStart"/>
-      <w:r>
-        <w:t>document.getElementById</w:t>
-      </w:r>
-      <w:proofErr w:type="spellEnd"/>
-      <w:proofErr w:type="gramEnd"/>
-      <w:r>
-        <w:t>("</w:t>
-      </w:r>
-      <w:proofErr w:type="spellStart"/>
-      <w:r>
-        <w:t>signupPassword</w:t>
-      </w:r>
-      <w:proofErr w:type="spellEnd"/>
-      <w:r>
-        <w:t>").value;</w:t>
-      </w:r>
-    </w:p>
-    <w:p>
-      <w:r>
-        <w:t xml:space="preserve">    let </w:t>
-      </w:r>
-      <w:proofErr w:type="spellStart"/>
-      <w:r>
-        <w:t>confirmPassword</w:t>
-      </w:r>
-      <w:proofErr w:type="spellEnd"/>
-      <w:r>
-        <w:t xml:space="preserve"> = </w:t>
-      </w:r>
-      <w:proofErr w:type="spellStart"/>
-      <w:proofErr w:type="gramStart"/>
-      <w:r>
-        <w:t>document.getElementById</w:t>
-      </w:r>
-      <w:proofErr w:type="spellEnd"/>
-      <w:proofErr w:type="gramEnd"/>
-      <w:r>
-        <w:t>("</w:t>
-      </w:r>
-      <w:proofErr w:type="spellStart"/>
-      <w:r>
-        <w:t>confirmPassword</w:t>
-      </w:r>
-      <w:proofErr w:type="spellEnd"/>
-      <w:r>
-        <w:t>").value;</w:t>
-      </w:r>
-    </w:p>
-    <w:p/>
-    <w:p>
-      <w:r>
-        <w:t>    if (</w:t>
-      </w:r>
-      <w:proofErr w:type="gramStart"/>
-      <w:r>
-        <w:t>password !</w:t>
-      </w:r>
-      <w:proofErr w:type="gramEnd"/>
-      <w:r>
-        <w:t xml:space="preserve">== </w:t>
-      </w:r>
-      <w:proofErr w:type="spellStart"/>
-      <w:r>
-        <w:t>confirmPassword</w:t>
-      </w:r>
-      <w:proofErr w:type="spellEnd"/>
-      <w:r>
-        <w:t>) {</w:t>
-      </w:r>
-    </w:p>
-    <w:p>
-      <w:r>
-        <w:t xml:space="preserve">        </w:t>
-      </w:r>
-      <w:proofErr w:type="gramStart"/>
-      <w:r>
-        <w:t>alert(</w:t>
-      </w:r>
-      <w:proofErr w:type="gramEnd"/>
-      <w:r>
-        <w:t xml:space="preserve">"Passwords do not match </w:t>
-      </w:r>
-      <w:r>
-        <w:rPr>
-          <w:rFonts w:ascii="Segoe UI Emoji" w:hAnsi="Segoe UI Emoji" w:cs="Segoe UI Emoji"/>
-        </w:rPr>
-        <w:t>❌</w:t>
-      </w:r>
-      <w:r>
-        <w:t>");</w:t>
-      </w:r>
-    </w:p>
-    <w:p>
-      <w:r>
-        <w:t>        return;</w:t>
-      </w:r>
-    </w:p>
-    <w:p>
-      <w:r>
-        <w:t>    }</w:t>
-      </w:r>
-    </w:p>
-    <w:p/>
-    <w:p>
-      <w:r>
-        <w:t xml:space="preserve">    </w:t>
-      </w:r>
-      <w:proofErr w:type="spellStart"/>
-      <w:r>
-        <w:t>localStorage.setItem</w:t>
-      </w:r>
-      <w:proofErr w:type="spellEnd"/>
-      <w:r>
-        <w:t>("username", username);</w:t>
-      </w:r>
-    </w:p>
-    <w:p>
-      <w:r>
-        <w:t xml:space="preserve">    </w:t>
-      </w:r>
-      <w:proofErr w:type="spellStart"/>
-      <w:r>
-        <w:t>localStorage.setItem</w:t>
-      </w:r>
-      <w:proofErr w:type="spellEnd"/>
-      <w:r>
-        <w:t>("password", password);</w:t>
-      </w:r>
-    </w:p>
-    <w:p/>
-    <w:p>
-      <w:r>
         <w:t xml:space="preserve">    </w:t>
       </w:r>
       <w:proofErr w:type="gramStart"/>
@@ -6972,6 +7008,7 @@
   <w:style w:type="character" w:default="1" w:styleId="DefaultParagraphFont">
     <w:name w:val="Default Paragraph Font"/>
     <w:uiPriority w:val="1"/>
+    <w:semiHidden/>
     <w:unhideWhenUsed/>
   </w:style>
   <w:style w:type="table" w:default="1" w:styleId="TableNormal">

</xml_diff>